<commit_message>
update МДК 05.02 ДКР?
</commit_message>
<xml_diff>
--- a/МДК 05.02/ДКР 7/Отчет(ДКР) ЛАБА 7 .docx
+++ b/МДК 05.02/ДКР 7/Отчет(ДКР) ЛАБА 7 .docx
@@ -488,7 +488,7 @@
           <w:sz w:val="28"/>
           <w:szCs w:val="28"/>
         </w:rPr>
-        <w:t xml:space="preserve">                                                                         </w:t>
+        <w:t xml:space="preserve">                                                                        </w:t>
       </w:r>
       <w:r>
         <w:rPr>
@@ -534,7 +534,7 @@
           <w:sz w:val="28"/>
           <w:szCs w:val="28"/>
         </w:rPr>
-        <w:t xml:space="preserve">                                                    </w:t>
+        <w:t xml:space="preserve">                                                   </w:t>
       </w:r>
       <w:r>
         <w:rPr>
@@ -576,14 +576,6 @@
           <w:szCs w:val="28"/>
         </w:rPr>
         <w:t xml:space="preserve">                                                    </w:t>
-      </w:r>
-      <w:r>
-        <w:rPr>
-          <w:color w:val="000000" w:themeColor="text1"/>
-          <w:sz w:val="28"/>
-          <w:szCs w:val="28"/>
-        </w:rPr>
-        <w:t xml:space="preserve"> </w:t>
       </w:r>
       <w:r>
         <w:rPr>
@@ -1196,7 +1188,9 @@
     </w:p>
     <w:p>
       <w:pPr>
-        <w:spacing w:line="259" w:lineRule="auto"/>
+        <w:spacing w:line="360" w:lineRule="auto"/>
+        <w:ind w:firstLine="709"/>
+        <w:jc w:val="both"/>
         <w:rPr>
           <w:rFonts w:ascii="Times New Roman" w:hAnsi="Times New Roman" w:cs="Times New Roman"/>
           <w:b/>
@@ -1646,105 +1640,641 @@
         </w:rPr>
         <w:t>Рисунок 1 – Пример ломанной генератора</w:t>
       </w:r>
+      <w:r>
+        <w:rPr>
+          <w:rFonts w:ascii="Times New Roman" w:hAnsi="Times New Roman" w:cs="Times New Roman"/>
+        </w:rPr>
+        <w:br w:type="page"/>
+      </w:r>
+    </w:p>
+    <w:p>
+      <w:pPr>
+        <w:spacing w:line="360" w:lineRule="auto"/>
+        <w:ind w:firstLine="709"/>
+        <w:jc w:val="both"/>
+        <w:rPr>
+          <w:rFonts w:ascii="Times New Roman" w:hAnsi="Times New Roman" w:cs="Times New Roman"/>
+          <w:b/>
+          <w:bCs/>
+          <w:color w:val="000000" w:themeColor="text1"/>
+          <w:sz w:val="28"/>
+          <w:szCs w:val="28"/>
+        </w:rPr>
+      </w:pPr>
+      <w:r>
+        <w:rPr>
+          <w:rFonts w:ascii="Times New Roman" w:hAnsi="Times New Roman" w:cs="Times New Roman"/>
+          <w:b/>
+          <w:bCs/>
+          <w:color w:val="000000" w:themeColor="text1"/>
+          <w:sz w:val="28"/>
+          <w:szCs w:val="28"/>
+        </w:rPr>
+        <w:lastRenderedPageBreak/>
+        <w:t>Описание алгоритма:</w:t>
+      </w:r>
+    </w:p>
+    <w:p>
+      <w:pPr>
+        <w:spacing w:line="360" w:lineRule="auto"/>
+        <w:ind w:firstLine="709"/>
+        <w:jc w:val="both"/>
+        <w:rPr>
+          <w:rFonts w:ascii="Times New Roman" w:hAnsi="Times New Roman" w:cs="Times New Roman"/>
+          <w:color w:val="000000" w:themeColor="text1"/>
+          <w:sz w:val="28"/>
+          <w:szCs w:val="28"/>
+        </w:rPr>
+      </w:pPr>
+      <w:r>
+        <w:rPr>
+          <w:rFonts w:ascii="Times New Roman" w:hAnsi="Times New Roman" w:cs="Times New Roman"/>
+          <w:color w:val="000000" w:themeColor="text1"/>
+          <w:sz w:val="28"/>
+          <w:szCs w:val="28"/>
+        </w:rPr>
+        <w:t xml:space="preserve">Попытаюсь описать алгоритм максимально кратко. Для начало стоит </w:t>
+      </w:r>
+      <w:proofErr w:type="gramStart"/>
+      <w:r>
+        <w:rPr>
+          <w:rFonts w:ascii="Times New Roman" w:hAnsi="Times New Roman" w:cs="Times New Roman"/>
+          <w:color w:val="000000" w:themeColor="text1"/>
+          <w:sz w:val="28"/>
+          <w:szCs w:val="28"/>
+        </w:rPr>
+        <w:t>сказать</w:t>
+      </w:r>
+      <w:proofErr w:type="gramEnd"/>
+      <w:r>
+        <w:rPr>
+          <w:rFonts w:ascii="Times New Roman" w:hAnsi="Times New Roman" w:cs="Times New Roman"/>
+          <w:color w:val="000000" w:themeColor="text1"/>
+          <w:sz w:val="28"/>
+          <w:szCs w:val="28"/>
+        </w:rPr>
+        <w:t xml:space="preserve"> что основой всего является класс </w:t>
+      </w:r>
+      <w:r>
+        <w:rPr>
+          <w:rFonts w:ascii="Times New Roman" w:hAnsi="Times New Roman" w:cs="Times New Roman"/>
+          <w:color w:val="000000" w:themeColor="text1"/>
+          <w:sz w:val="28"/>
+          <w:szCs w:val="28"/>
+          <w:lang w:val="en-US"/>
+        </w:rPr>
+        <w:t>DKR</w:t>
+      </w:r>
+      <w:r>
+        <w:rPr>
+          <w:rFonts w:ascii="Times New Roman" w:hAnsi="Times New Roman" w:cs="Times New Roman"/>
+          <w:color w:val="000000" w:themeColor="text1"/>
+          <w:sz w:val="28"/>
+          <w:szCs w:val="28"/>
+        </w:rPr>
+        <w:t xml:space="preserve">, </w:t>
+      </w:r>
+      <w:r>
+        <w:rPr>
+          <w:rFonts w:ascii="Times New Roman" w:hAnsi="Times New Roman" w:cs="Times New Roman"/>
+          <w:color w:val="000000" w:themeColor="text1"/>
+          <w:sz w:val="28"/>
+          <w:szCs w:val="28"/>
+        </w:rPr>
+        <w:t>который в своей основе содержит 4 приватных метода и 1 публичный (метод инициализации)</w:t>
+      </w:r>
+      <w:r>
+        <w:rPr>
+          <w:rFonts w:ascii="Times New Roman" w:hAnsi="Times New Roman" w:cs="Times New Roman"/>
+          <w:color w:val="000000" w:themeColor="text1"/>
+          <w:sz w:val="28"/>
+          <w:szCs w:val="28"/>
+        </w:rPr>
+        <w:t xml:space="preserve">, </w:t>
+      </w:r>
+      <w:r>
+        <w:rPr>
+          <w:rFonts w:ascii="Times New Roman" w:hAnsi="Times New Roman" w:cs="Times New Roman"/>
+          <w:color w:val="000000" w:themeColor="text1"/>
+          <w:sz w:val="28"/>
+          <w:szCs w:val="28"/>
+        </w:rPr>
+        <w:t>именно его вы увидите при работе с классом. Все методы в классе являются одновременно и класс методами (</w:t>
+      </w:r>
+      <w:r>
+        <w:rPr>
+          <w:rFonts w:ascii="Times New Roman" w:hAnsi="Times New Roman" w:cs="Times New Roman"/>
+          <w:color w:val="000000" w:themeColor="text1"/>
+          <w:sz w:val="28"/>
+          <w:szCs w:val="28"/>
+        </w:rPr>
+        <w:t>@</w:t>
+      </w:r>
+      <w:proofErr w:type="spellStart"/>
+      <w:r>
+        <w:rPr>
+          <w:rFonts w:ascii="Times New Roman" w:hAnsi="Times New Roman" w:cs="Times New Roman"/>
+          <w:color w:val="000000" w:themeColor="text1"/>
+          <w:sz w:val="28"/>
+          <w:szCs w:val="28"/>
+          <w:lang w:val="en-US"/>
+        </w:rPr>
+        <w:t>classmethod</w:t>
+      </w:r>
+      <w:proofErr w:type="spellEnd"/>
+      <w:r>
+        <w:rPr>
+          <w:rFonts w:ascii="Times New Roman" w:hAnsi="Times New Roman" w:cs="Times New Roman"/>
+          <w:color w:val="000000" w:themeColor="text1"/>
+          <w:sz w:val="28"/>
+          <w:szCs w:val="28"/>
+        </w:rPr>
+        <w:t>) и статическими(</w:t>
+      </w:r>
+      <w:r>
+        <w:rPr>
+          <w:rFonts w:ascii="Times New Roman" w:hAnsi="Times New Roman" w:cs="Times New Roman"/>
+          <w:color w:val="000000" w:themeColor="text1"/>
+          <w:sz w:val="28"/>
+          <w:szCs w:val="28"/>
+        </w:rPr>
+        <w:t>@</w:t>
+      </w:r>
+      <w:proofErr w:type="spellStart"/>
+      <w:r>
+        <w:rPr>
+          <w:rFonts w:ascii="Times New Roman" w:hAnsi="Times New Roman" w:cs="Times New Roman"/>
+          <w:color w:val="000000" w:themeColor="text1"/>
+          <w:sz w:val="28"/>
+          <w:szCs w:val="28"/>
+          <w:lang w:val="en-US"/>
+        </w:rPr>
+        <w:t>staticmethod</w:t>
+      </w:r>
+      <w:proofErr w:type="spellEnd"/>
+      <w:r>
+        <w:rPr>
+          <w:rFonts w:ascii="Times New Roman" w:hAnsi="Times New Roman" w:cs="Times New Roman"/>
+          <w:color w:val="000000" w:themeColor="text1"/>
+          <w:sz w:val="28"/>
+          <w:szCs w:val="28"/>
+        </w:rPr>
+        <w:t>)</w:t>
+      </w:r>
+      <w:r>
+        <w:rPr>
+          <w:rFonts w:ascii="Times New Roman" w:hAnsi="Times New Roman" w:cs="Times New Roman"/>
+          <w:color w:val="000000" w:themeColor="text1"/>
+          <w:sz w:val="28"/>
+          <w:szCs w:val="28"/>
+        </w:rPr>
+        <w:t xml:space="preserve">, </w:t>
+      </w:r>
+      <w:r>
+        <w:rPr>
+          <w:rFonts w:ascii="Times New Roman" w:hAnsi="Times New Roman" w:cs="Times New Roman"/>
+          <w:color w:val="000000" w:themeColor="text1"/>
+          <w:sz w:val="28"/>
+          <w:szCs w:val="28"/>
+        </w:rPr>
+        <w:t>но не в привычном понимании того</w:t>
+      </w:r>
+      <w:r>
+        <w:rPr>
+          <w:rFonts w:ascii="Times New Roman" w:hAnsi="Times New Roman" w:cs="Times New Roman"/>
+          <w:color w:val="000000" w:themeColor="text1"/>
+          <w:sz w:val="28"/>
+          <w:szCs w:val="28"/>
+        </w:rPr>
+        <w:t xml:space="preserve">, </w:t>
+      </w:r>
+      <w:r>
+        <w:rPr>
+          <w:rFonts w:ascii="Times New Roman" w:hAnsi="Times New Roman" w:cs="Times New Roman"/>
+          <w:color w:val="000000" w:themeColor="text1"/>
+          <w:sz w:val="28"/>
+          <w:szCs w:val="28"/>
+        </w:rPr>
+        <w:t xml:space="preserve">кто </w:t>
+      </w:r>
+      <w:proofErr w:type="spellStart"/>
+      <w:r>
+        <w:rPr>
+          <w:rFonts w:ascii="Times New Roman" w:hAnsi="Times New Roman" w:cs="Times New Roman"/>
+          <w:color w:val="000000" w:themeColor="text1"/>
+          <w:sz w:val="28"/>
+          <w:szCs w:val="28"/>
+        </w:rPr>
+        <w:t>кодит</w:t>
+      </w:r>
+      <w:proofErr w:type="spellEnd"/>
+      <w:r>
+        <w:rPr>
+          <w:rFonts w:ascii="Times New Roman" w:hAnsi="Times New Roman" w:cs="Times New Roman"/>
+          <w:color w:val="000000" w:themeColor="text1"/>
+          <w:sz w:val="28"/>
+          <w:szCs w:val="28"/>
+        </w:rPr>
+        <w:t xml:space="preserve"> на </w:t>
+      </w:r>
+      <w:r>
+        <w:rPr>
+          <w:rFonts w:ascii="Times New Roman" w:hAnsi="Times New Roman" w:cs="Times New Roman"/>
+          <w:color w:val="000000" w:themeColor="text1"/>
+          <w:sz w:val="28"/>
+          <w:szCs w:val="28"/>
+          <w:lang w:val="en-US"/>
+        </w:rPr>
+        <w:t>python</w:t>
+      </w:r>
+      <w:r>
+        <w:rPr>
+          <w:rFonts w:ascii="Times New Roman" w:hAnsi="Times New Roman" w:cs="Times New Roman"/>
+          <w:color w:val="000000" w:themeColor="text1"/>
+          <w:sz w:val="28"/>
+          <w:szCs w:val="28"/>
+        </w:rPr>
+        <w:t xml:space="preserve">, </w:t>
+      </w:r>
+      <w:r>
+        <w:rPr>
+          <w:rFonts w:ascii="Times New Roman" w:hAnsi="Times New Roman" w:cs="Times New Roman"/>
+          <w:color w:val="000000" w:themeColor="text1"/>
+          <w:sz w:val="28"/>
+          <w:szCs w:val="28"/>
+        </w:rPr>
+        <w:t>т.к. тут нет отдельно статик метода</w:t>
+      </w:r>
+      <w:r>
+        <w:rPr>
+          <w:rFonts w:ascii="Times New Roman" w:hAnsi="Times New Roman" w:cs="Times New Roman"/>
+          <w:color w:val="000000" w:themeColor="text1"/>
+          <w:sz w:val="28"/>
+          <w:szCs w:val="28"/>
+        </w:rPr>
+        <w:t xml:space="preserve">, </w:t>
+      </w:r>
+      <w:r>
+        <w:rPr>
+          <w:rFonts w:ascii="Times New Roman" w:hAnsi="Times New Roman" w:cs="Times New Roman"/>
+          <w:color w:val="000000" w:themeColor="text1"/>
+          <w:sz w:val="28"/>
+          <w:szCs w:val="28"/>
+        </w:rPr>
+        <w:t xml:space="preserve">который не может работать с атрибутами класса и служит обычно либо для функций </w:t>
+      </w:r>
+      <w:proofErr w:type="gramStart"/>
+      <w:r>
+        <w:rPr>
+          <w:rFonts w:ascii="Times New Roman" w:hAnsi="Times New Roman" w:cs="Times New Roman"/>
+          <w:color w:val="000000" w:themeColor="text1"/>
+          <w:sz w:val="28"/>
+          <w:szCs w:val="28"/>
+        </w:rPr>
+        <w:t>отладчиков</w:t>
+      </w:r>
+      <w:proofErr w:type="gramEnd"/>
+      <w:r>
+        <w:rPr>
+          <w:rFonts w:ascii="Times New Roman" w:hAnsi="Times New Roman" w:cs="Times New Roman"/>
+          <w:color w:val="000000" w:themeColor="text1"/>
+          <w:sz w:val="28"/>
+          <w:szCs w:val="28"/>
+        </w:rPr>
+        <w:t xml:space="preserve"> либо для компараторов. Из методов: есть метод для подгрузки базовые настроек окна</w:t>
+      </w:r>
+      <w:r>
+        <w:rPr>
+          <w:rFonts w:ascii="Times New Roman" w:hAnsi="Times New Roman" w:cs="Times New Roman"/>
+          <w:color w:val="000000" w:themeColor="text1"/>
+          <w:sz w:val="28"/>
+          <w:szCs w:val="28"/>
+        </w:rPr>
+        <w:t xml:space="preserve">, </w:t>
+      </w:r>
+      <w:r>
+        <w:rPr>
+          <w:rFonts w:ascii="Times New Roman" w:hAnsi="Times New Roman" w:cs="Times New Roman"/>
+          <w:color w:val="000000" w:themeColor="text1"/>
+          <w:sz w:val="28"/>
+          <w:szCs w:val="28"/>
+        </w:rPr>
+        <w:t>отрисовки самого фрактала</w:t>
+      </w:r>
+      <w:r>
+        <w:rPr>
+          <w:rFonts w:ascii="Times New Roman" w:hAnsi="Times New Roman" w:cs="Times New Roman"/>
+          <w:color w:val="000000" w:themeColor="text1"/>
+          <w:sz w:val="28"/>
+          <w:szCs w:val="28"/>
+        </w:rPr>
+        <w:t xml:space="preserve">, </w:t>
+      </w:r>
+      <w:r>
+        <w:rPr>
+          <w:rFonts w:ascii="Times New Roman" w:hAnsi="Times New Roman" w:cs="Times New Roman"/>
+          <w:color w:val="000000" w:themeColor="text1"/>
+          <w:sz w:val="28"/>
+          <w:szCs w:val="28"/>
+        </w:rPr>
+        <w:t>обработчик клавиш</w:t>
+      </w:r>
+      <w:r>
+        <w:rPr>
+          <w:rFonts w:ascii="Times New Roman" w:hAnsi="Times New Roman" w:cs="Times New Roman"/>
+          <w:color w:val="000000" w:themeColor="text1"/>
+          <w:sz w:val="28"/>
+          <w:szCs w:val="28"/>
+        </w:rPr>
+        <w:t xml:space="preserve">, </w:t>
+      </w:r>
+      <w:r>
+        <w:rPr>
+          <w:rFonts w:ascii="Times New Roman" w:hAnsi="Times New Roman" w:cs="Times New Roman"/>
+          <w:color w:val="000000" w:themeColor="text1"/>
+          <w:sz w:val="28"/>
+          <w:szCs w:val="28"/>
+        </w:rPr>
+        <w:t>метод перерисовки окна и основной метод</w:t>
+      </w:r>
+      <w:r>
+        <w:rPr>
+          <w:rFonts w:ascii="Times New Roman" w:hAnsi="Times New Roman" w:cs="Times New Roman"/>
+          <w:color w:val="000000" w:themeColor="text1"/>
+          <w:sz w:val="28"/>
+          <w:szCs w:val="28"/>
+        </w:rPr>
+        <w:t xml:space="preserve">, </w:t>
+      </w:r>
+      <w:r>
+        <w:rPr>
+          <w:rFonts w:ascii="Times New Roman" w:hAnsi="Times New Roman" w:cs="Times New Roman"/>
+          <w:color w:val="000000" w:themeColor="text1"/>
+          <w:sz w:val="28"/>
+          <w:szCs w:val="28"/>
+        </w:rPr>
+        <w:t>который вызывает все другие методы. Используются</w:t>
+      </w:r>
+      <w:r>
+        <w:rPr>
+          <w:rFonts w:ascii="Times New Roman" w:hAnsi="Times New Roman" w:cs="Times New Roman"/>
+          <w:color w:val="000000" w:themeColor="text1"/>
+          <w:sz w:val="28"/>
+          <w:szCs w:val="28"/>
+        </w:rPr>
+        <w:t xml:space="preserve">, </w:t>
+      </w:r>
+      <w:r>
+        <w:rPr>
+          <w:rFonts w:ascii="Times New Roman" w:hAnsi="Times New Roman" w:cs="Times New Roman"/>
+          <w:color w:val="000000" w:themeColor="text1"/>
+          <w:sz w:val="28"/>
+          <w:szCs w:val="28"/>
+        </w:rPr>
+        <w:t>так же классовые переменные</w:t>
+      </w:r>
+      <w:r>
+        <w:rPr>
+          <w:rFonts w:ascii="Times New Roman" w:hAnsi="Times New Roman" w:cs="Times New Roman"/>
+          <w:color w:val="000000" w:themeColor="text1"/>
+          <w:sz w:val="28"/>
+          <w:szCs w:val="28"/>
+        </w:rPr>
+        <w:t xml:space="preserve">, </w:t>
+      </w:r>
+      <w:r>
+        <w:rPr>
+          <w:rFonts w:ascii="Times New Roman" w:hAnsi="Times New Roman" w:cs="Times New Roman"/>
+          <w:color w:val="000000" w:themeColor="text1"/>
+          <w:sz w:val="28"/>
+          <w:szCs w:val="28"/>
+        </w:rPr>
+        <w:t>т.к. с экземплярами я не вижу смысла тут работать</w:t>
+      </w:r>
+      <w:r>
+        <w:rPr>
+          <w:rFonts w:ascii="Times New Roman" w:hAnsi="Times New Roman" w:cs="Times New Roman"/>
+          <w:color w:val="000000" w:themeColor="text1"/>
+          <w:sz w:val="28"/>
+          <w:szCs w:val="28"/>
+        </w:rPr>
+        <w:t xml:space="preserve">, </w:t>
+      </w:r>
+      <w:r>
+        <w:rPr>
+          <w:rFonts w:ascii="Times New Roman" w:hAnsi="Times New Roman" w:cs="Times New Roman"/>
+          <w:color w:val="000000" w:themeColor="text1"/>
+          <w:sz w:val="28"/>
+          <w:szCs w:val="28"/>
+        </w:rPr>
+        <w:t>так как функция для отрисовки фрактала направлена на рисование конкретного и не имеет адаптивности под другие. Всё это добро из указания ТЗ обернуто в конструкцию для организации модуля</w:t>
+      </w:r>
+      <w:r>
+        <w:rPr>
+          <w:rFonts w:ascii="Times New Roman" w:hAnsi="Times New Roman" w:cs="Times New Roman"/>
+          <w:color w:val="000000" w:themeColor="text1"/>
+          <w:sz w:val="28"/>
+          <w:szCs w:val="28"/>
+        </w:rPr>
+        <w:t>.</w:t>
+      </w:r>
+    </w:p>
+    <w:p>
+      <w:pPr>
+        <w:spacing w:line="360" w:lineRule="auto"/>
+        <w:ind w:firstLine="709"/>
+        <w:jc w:val="both"/>
+        <w:rPr>
+          <w:rFonts w:ascii="Times New Roman" w:hAnsi="Times New Roman" w:cs="Times New Roman"/>
+          <w:color w:val="000000" w:themeColor="text1"/>
+          <w:sz w:val="28"/>
+          <w:szCs w:val="28"/>
+        </w:rPr>
+      </w:pPr>
+      <w:r>
+        <w:rPr>
+          <w:rFonts w:ascii="Times New Roman" w:hAnsi="Times New Roman" w:cs="Times New Roman"/>
+          <w:color w:val="000000" w:themeColor="text1"/>
+          <w:sz w:val="28"/>
+          <w:szCs w:val="28"/>
+        </w:rPr>
+        <w:t>Что касается рисования фрактала</w:t>
+      </w:r>
+      <w:r>
+        <w:rPr>
+          <w:rFonts w:ascii="Times New Roman" w:hAnsi="Times New Roman" w:cs="Times New Roman"/>
+          <w:color w:val="000000" w:themeColor="text1"/>
+          <w:sz w:val="28"/>
+          <w:szCs w:val="28"/>
+        </w:rPr>
+        <w:t xml:space="preserve">, </w:t>
+      </w:r>
+      <w:r>
+        <w:rPr>
+          <w:rFonts w:ascii="Times New Roman" w:hAnsi="Times New Roman" w:cs="Times New Roman"/>
+          <w:color w:val="000000" w:themeColor="text1"/>
+          <w:sz w:val="28"/>
+          <w:szCs w:val="28"/>
+        </w:rPr>
+        <w:t>тут всё максимально просто. Условно возьмем глубину = 1</w:t>
+      </w:r>
+      <w:r>
+        <w:rPr>
+          <w:rFonts w:ascii="Times New Roman" w:hAnsi="Times New Roman" w:cs="Times New Roman"/>
+          <w:color w:val="000000" w:themeColor="text1"/>
+          <w:sz w:val="28"/>
+          <w:szCs w:val="28"/>
+        </w:rPr>
+        <w:t xml:space="preserve">, </w:t>
+      </w:r>
+      <w:r>
+        <w:rPr>
+          <w:rFonts w:ascii="Times New Roman" w:hAnsi="Times New Roman" w:cs="Times New Roman"/>
+          <w:color w:val="000000" w:themeColor="text1"/>
+          <w:sz w:val="28"/>
+          <w:szCs w:val="28"/>
+        </w:rPr>
+        <w:t xml:space="preserve">тогда </w:t>
+      </w:r>
+      <w:proofErr w:type="spellStart"/>
+      <w:r>
+        <w:rPr>
+          <w:rFonts w:ascii="Times New Roman" w:hAnsi="Times New Roman" w:cs="Times New Roman"/>
+          <w:color w:val="000000" w:themeColor="text1"/>
+          <w:sz w:val="28"/>
+          <w:szCs w:val="28"/>
+        </w:rPr>
+        <w:t>предствим</w:t>
+      </w:r>
+      <w:proofErr w:type="spellEnd"/>
+      <w:r>
+        <w:rPr>
+          <w:rFonts w:ascii="Times New Roman" w:hAnsi="Times New Roman" w:cs="Times New Roman"/>
+          <w:color w:val="000000" w:themeColor="text1"/>
+          <w:sz w:val="28"/>
+          <w:szCs w:val="28"/>
+        </w:rPr>
+        <w:t xml:space="preserve"> что у нас есть невидимый квадрат 400 на 400. Мы его разбиваем на 9 квадратом (сетка 3</w:t>
+      </w:r>
+      <w:r>
+        <w:rPr>
+          <w:rFonts w:ascii="Times New Roman" w:hAnsi="Times New Roman" w:cs="Times New Roman"/>
+          <w:color w:val="000000" w:themeColor="text1"/>
+          <w:sz w:val="28"/>
+          <w:szCs w:val="28"/>
+          <w:lang w:val="en-US"/>
+        </w:rPr>
+        <w:t>x</w:t>
+      </w:r>
+      <w:r>
+        <w:rPr>
+          <w:rFonts w:ascii="Times New Roman" w:hAnsi="Times New Roman" w:cs="Times New Roman"/>
+          <w:color w:val="000000" w:themeColor="text1"/>
+          <w:sz w:val="28"/>
+          <w:szCs w:val="28"/>
+        </w:rPr>
+        <w:t xml:space="preserve">3) при этом записываем размеры этих маленьких квадратов. Мы спустились на глубину 0 и теперь у нас будет отрабатывать база </w:t>
+      </w:r>
+      <w:proofErr w:type="spellStart"/>
+      <w:r>
+        <w:rPr>
+          <w:rFonts w:ascii="Times New Roman" w:hAnsi="Times New Roman" w:cs="Times New Roman"/>
+          <w:color w:val="000000" w:themeColor="text1"/>
+          <w:sz w:val="28"/>
+          <w:szCs w:val="28"/>
+        </w:rPr>
+        <w:t>рекрсии</w:t>
+      </w:r>
+      <w:proofErr w:type="spellEnd"/>
+      <w:r>
+        <w:rPr>
+          <w:rFonts w:ascii="Times New Roman" w:hAnsi="Times New Roman" w:cs="Times New Roman"/>
+          <w:color w:val="000000" w:themeColor="text1"/>
+          <w:sz w:val="28"/>
+          <w:szCs w:val="28"/>
+        </w:rPr>
+        <w:t xml:space="preserve"> и рисуем эти квадраты с определенным размером</w:t>
+      </w:r>
+      <w:r>
+        <w:rPr>
+          <w:rFonts w:ascii="Times New Roman" w:hAnsi="Times New Roman" w:cs="Times New Roman"/>
+          <w:color w:val="000000" w:themeColor="text1"/>
+          <w:sz w:val="28"/>
+          <w:szCs w:val="28"/>
+        </w:rPr>
+        <w:t xml:space="preserve">, </w:t>
+      </w:r>
+      <w:r>
+        <w:rPr>
+          <w:rFonts w:ascii="Times New Roman" w:hAnsi="Times New Roman" w:cs="Times New Roman"/>
+          <w:color w:val="000000" w:themeColor="text1"/>
+          <w:sz w:val="28"/>
+          <w:szCs w:val="28"/>
+        </w:rPr>
+        <w:t>который мы записали. Главная особенность</w:t>
+      </w:r>
+      <w:r>
+        <w:rPr>
+          <w:rFonts w:ascii="Times New Roman" w:hAnsi="Times New Roman" w:cs="Times New Roman"/>
+          <w:color w:val="000000" w:themeColor="text1"/>
+          <w:sz w:val="28"/>
+          <w:szCs w:val="28"/>
+        </w:rPr>
+        <w:t>,</w:t>
+      </w:r>
+      <w:r>
+        <w:rPr>
+          <w:rFonts w:ascii="Times New Roman" w:hAnsi="Times New Roman" w:cs="Times New Roman"/>
+          <w:color w:val="000000" w:themeColor="text1"/>
+          <w:sz w:val="28"/>
+          <w:szCs w:val="28"/>
+        </w:rPr>
+        <w:t xml:space="preserve"> </w:t>
+      </w:r>
+      <w:proofErr w:type="gramStart"/>
+      <w:r>
+        <w:rPr>
+          <w:rFonts w:ascii="Times New Roman" w:hAnsi="Times New Roman" w:cs="Times New Roman"/>
+          <w:color w:val="000000" w:themeColor="text1"/>
+          <w:sz w:val="28"/>
+          <w:szCs w:val="28"/>
+        </w:rPr>
+        <w:t>что</w:t>
+      </w:r>
+      <w:proofErr w:type="gramEnd"/>
+      <w:r>
+        <w:rPr>
+          <w:rFonts w:ascii="Times New Roman" w:hAnsi="Times New Roman" w:cs="Times New Roman"/>
+          <w:color w:val="000000" w:themeColor="text1"/>
+          <w:sz w:val="28"/>
+          <w:szCs w:val="28"/>
+        </w:rPr>
+        <w:t xml:space="preserve"> когда мы доходим до центрального квадрата мы пропускаем декомпозицию для него и не рисуем его и получаем по центру пустоту.</w:t>
+      </w:r>
     </w:p>
     <w:p>
       <w:pPr>
         <w:spacing w:after="160" w:line="259" w:lineRule="auto"/>
         <w:rPr>
           <w:rFonts w:ascii="Times New Roman" w:hAnsi="Times New Roman" w:cs="Times New Roman"/>
-        </w:rPr>
-      </w:pPr>
-      <w:r>
-        <w:rPr>
-          <w:rFonts w:ascii="Times New Roman" w:hAnsi="Times New Roman" w:cs="Times New Roman"/>
+          <w:b/>
+          <w:bCs/>
+          <w:color w:val="000000" w:themeColor="text1"/>
+          <w:sz w:val="28"/>
+          <w:szCs w:val="28"/>
+        </w:rPr>
+      </w:pPr>
+      <w:r>
+        <w:rPr>
+          <w:rFonts w:ascii="Times New Roman" w:hAnsi="Times New Roman" w:cs="Times New Roman"/>
+          <w:b/>
+          <w:bCs/>
+          <w:color w:val="000000" w:themeColor="text1"/>
+          <w:sz w:val="28"/>
+          <w:szCs w:val="28"/>
         </w:rPr>
         <w:br w:type="page"/>
       </w:r>
-    </w:p>
-    <w:p>
-      <w:pPr>
-        <w:pStyle w:val="a4"/>
-        <w:spacing w:line="360" w:lineRule="auto"/>
-        <w:ind w:left="0" w:firstLine="709"/>
-        <w:jc w:val="center"/>
-        <w:rPr>
-          <w:rFonts w:ascii="Times New Roman" w:hAnsi="Times New Roman" w:cs="Times New Roman"/>
-        </w:rPr>
-      </w:pPr>
-    </w:p>
-    <w:p>
-      <w:pPr>
-        <w:spacing w:line="259" w:lineRule="auto"/>
-        <w:rPr>
-          <w:rFonts w:ascii="Times New Roman" w:hAnsi="Times New Roman" w:cs="Times New Roman"/>
-          <w:b/>
-          <w:bCs/>
-          <w:color w:val="000000" w:themeColor="text1"/>
-          <w:sz w:val="28"/>
-          <w:szCs w:val="28"/>
-        </w:rPr>
-      </w:pPr>
-      <w:r>
-        <w:rPr>
-          <w:rFonts w:ascii="Times New Roman" w:hAnsi="Times New Roman" w:cs="Times New Roman"/>
-          <w:b/>
-          <w:bCs/>
-          <w:color w:val="000000" w:themeColor="text1"/>
-          <w:sz w:val="28"/>
-          <w:szCs w:val="28"/>
-        </w:rPr>
-        <w:t>Описание алгоритма:</w:t>
-      </w:r>
-    </w:p>
-    <w:p>
-      <w:pPr>
-        <w:spacing w:line="259" w:lineRule="auto"/>
-        <w:rPr>
-          <w:rFonts w:ascii="Times New Roman" w:hAnsi="Times New Roman" w:cs="Times New Roman"/>
-          <w:b/>
-          <w:bCs/>
-          <w:color w:val="000000" w:themeColor="text1"/>
-          <w:sz w:val="28"/>
-          <w:szCs w:val="28"/>
-        </w:rPr>
-      </w:pPr>
-    </w:p>
-    <w:p>
-      <w:pPr>
-        <w:spacing w:after="160" w:line="259" w:lineRule="auto"/>
-        <w:rPr>
-          <w:rFonts w:ascii="Times New Roman" w:hAnsi="Times New Roman" w:cs="Times New Roman"/>
-          <w:b/>
-          <w:bCs/>
-          <w:color w:val="000000" w:themeColor="text1"/>
-          <w:sz w:val="28"/>
-          <w:szCs w:val="28"/>
-        </w:rPr>
-      </w:pPr>
-      <w:r>
-        <w:rPr>
-          <w:rFonts w:ascii="Times New Roman" w:hAnsi="Times New Roman" w:cs="Times New Roman"/>
-          <w:b/>
-          <w:bCs/>
-          <w:color w:val="000000" w:themeColor="text1"/>
-          <w:sz w:val="28"/>
-          <w:szCs w:val="28"/>
-        </w:rPr>
-        <w:br w:type="page"/>
-      </w:r>
-    </w:p>
-    <w:p>
-      <w:pPr>
-        <w:spacing w:line="259" w:lineRule="auto"/>
-        <w:rPr>
-          <w:rFonts w:ascii="Times New Roman" w:hAnsi="Times New Roman" w:cs="Times New Roman"/>
-          <w:b/>
-          <w:bCs/>
-          <w:color w:val="000000" w:themeColor="text1"/>
-          <w:sz w:val="28"/>
-          <w:szCs w:val="28"/>
-        </w:rPr>
-      </w:pPr>
       <w:r>
         <w:rPr>
           <w:b/>
@@ -1754,7 +2284,6 @@
           <w:sz w:val="28"/>
           <w:szCs w:val="28"/>
         </w:rPr>
-        <w:lastRenderedPageBreak/>
         <w:drawing>
           <wp:anchor distT="0" distB="0" distL="114300" distR="114300" simplePos="0" relativeHeight="251661312" behindDoc="1" locked="0" layoutInCell="1" allowOverlap="1" wp14:anchorId="7320987D" wp14:editId="23F53040">
             <wp:simplePos x="0" y="0"/>
@@ -1820,476 +2349,6 @@
     </w:p>
     <w:p>
       <w:pPr>
-        <w:spacing w:line="259" w:lineRule="auto"/>
-        <w:jc w:val="center"/>
-        <w:rPr>
-          <w:rFonts w:ascii="Times New Roman" w:hAnsi="Times New Roman" w:cs="Times New Roman"/>
-          <w:b/>
-          <w:bCs/>
-          <w:color w:val="000000" w:themeColor="text1"/>
-          <w:sz w:val="28"/>
-          <w:szCs w:val="28"/>
-        </w:rPr>
-      </w:pPr>
-      <w:r>
-        <w:rPr>
-          <w:rFonts w:ascii="Times New Roman" w:hAnsi="Times New Roman" w:cs="Times New Roman"/>
-          <w:b/>
-          <w:bCs/>
-          <w:color w:val="000000" w:themeColor="text1"/>
-          <w:sz w:val="28"/>
-          <w:szCs w:val="28"/>
-        </w:rPr>
-        <w:t>Схема Алгоритма</w:t>
-      </w:r>
-    </w:p>
-    <w:p>
-      <w:pPr>
-        <w:spacing w:line="259" w:lineRule="auto"/>
-        <w:jc w:val="center"/>
-        <w:rPr>
-          <w:rFonts w:ascii="Times New Roman" w:hAnsi="Times New Roman" w:cs="Times New Roman"/>
-          <w:b/>
-          <w:bCs/>
-          <w:color w:val="000000" w:themeColor="text1"/>
-          <w:sz w:val="28"/>
-          <w:szCs w:val="28"/>
-        </w:rPr>
-      </w:pPr>
-    </w:p>
-    <w:p>
-      <w:pPr>
-        <w:spacing w:line="259" w:lineRule="auto"/>
-        <w:rPr>
-          <w:rFonts w:ascii="Times New Roman" w:hAnsi="Times New Roman" w:cs="Times New Roman"/>
-          <w:b/>
-          <w:bCs/>
-          <w:color w:val="000000" w:themeColor="text1"/>
-          <w:sz w:val="28"/>
-          <w:szCs w:val="28"/>
-        </w:rPr>
-      </w:pPr>
-      <w:r>
-        <w:rPr>
-          <w:rFonts w:ascii="Times New Roman" w:hAnsi="Times New Roman" w:cs="Times New Roman"/>
-          <w:b/>
-          <w:bCs/>
-          <w:color w:val="000000" w:themeColor="text1"/>
-          <w:sz w:val="28"/>
-          <w:szCs w:val="28"/>
-        </w:rPr>
-        <w:t>Задание №1</w:t>
-      </w:r>
-    </w:p>
-    <w:p>
-      <w:pPr>
-        <w:spacing w:after="160" w:line="259" w:lineRule="auto"/>
-        <w:rPr>
-          <w:rFonts w:ascii="Times New Roman" w:hAnsi="Times New Roman" w:cs="Times New Roman"/>
-          <w:b/>
-          <w:bCs/>
-          <w:color w:val="000000" w:themeColor="text1"/>
-          <w:sz w:val="28"/>
-          <w:szCs w:val="28"/>
-        </w:rPr>
-      </w:pPr>
-      <w:r>
-        <w:rPr>
-          <w:rFonts w:ascii="Times New Roman" w:hAnsi="Times New Roman" w:cs="Times New Roman"/>
-          <w:b/>
-          <w:bCs/>
-          <w:noProof/>
-          <w:color w:val="FFFFFF" w:themeColor="background1"/>
-          <w:sz w:val="28"/>
-          <w:szCs w:val="28"/>
-        </w:rPr>
-        <mc:AlternateContent>
-          <mc:Choice Requires="wpi">
-            <w:drawing>
-              <wp:anchor distT="0" distB="0" distL="114300" distR="114300" simplePos="0" relativeHeight="251689984" behindDoc="0" locked="0" layoutInCell="1" allowOverlap="1" wp14:anchorId="679BAACA" wp14:editId="5E94BC5E">
-                <wp:simplePos x="0" y="0"/>
-                <wp:positionH relativeFrom="column">
-                  <wp:posOffset>683895</wp:posOffset>
-                </wp:positionH>
-                <wp:positionV relativeFrom="paragraph">
-                  <wp:posOffset>8629650</wp:posOffset>
-                </wp:positionV>
-                <wp:extent cx="169155" cy="220860"/>
-                <wp:effectExtent l="38100" t="38100" r="40640" b="46355"/>
-                <wp:wrapNone/>
-                <wp:docPr id="1655431783" name="Рукописный ввод 29"/>
-                <wp:cNvGraphicFramePr/>
-                <a:graphic xmlns:a="http://schemas.openxmlformats.org/drawingml/2006/main">
-                  <a:graphicData uri="http://schemas.microsoft.com/office/word/2010/wordprocessingInk">
-                    <w14:contentPart bwMode="auto" r:id="rId8">
-                      <w14:nvContentPartPr>
-                        <w14:cNvContentPartPr/>
-                      </w14:nvContentPartPr>
-                      <w14:xfrm>
-                        <a:off x="0" y="0"/>
-                        <a:ext cx="169155" cy="220860"/>
-                      </w14:xfrm>
-                    </w14:contentPart>
-                  </a:graphicData>
-                </a:graphic>
-              </wp:anchor>
-            </w:drawing>
-          </mc:Choice>
-          <mc:Fallback>
-            <w:pict>
-              <v:shapetype w14:anchorId="09B53738" id="_x0000_t75" coordsize="21600,21600" o:spt="75" o:preferrelative="t" path="m@4@5l@4@11@9@11@9@5xe" filled="f" stroked="f">
-                <v:stroke joinstyle="miter"/>
-                <v:formulas>
-                  <v:f eqn="if lineDrawn pixelLineWidth 0"/>
-                  <v:f eqn="sum @0 1 0"/>
-                  <v:f eqn="sum 0 0 @1"/>
-                  <v:f eqn="prod @2 1 2"/>
-                  <v:f eqn="prod @3 21600 pixelWidth"/>
-                  <v:f eqn="prod @3 21600 pixelHeight"/>
-                  <v:f eqn="sum @0 0 1"/>
-                  <v:f eqn="prod @6 1 2"/>
-                  <v:f eqn="prod @7 21600 pixelWidth"/>
-                  <v:f eqn="sum @8 21600 0"/>
-                  <v:f eqn="prod @7 21600 pixelHeight"/>
-                  <v:f eqn="sum @10 21600 0"/>
-                </v:formulas>
-                <v:path o:extrusionok="f" gradientshapeok="t" o:connecttype="rect"/>
-                <o:lock v:ext="edit" aspectratio="t"/>
-              </v:shapetype>
-              <v:shape id="Рукописный ввод 29" o:spid="_x0000_s1026" type="#_x0000_t75" style="position:absolute;margin-left:53.5pt;margin-top:679.15pt;width:14pt;height:18.1pt;z-index:251689984;visibility:visible;mso-wrap-style:square;mso-wrap-distance-left:9pt;mso-wrap-distance-top:0;mso-wrap-distance-right:9pt;mso-wrap-distance-bottom:0;mso-position-horizontal:absolute;mso-position-horizontal-relative:text;mso-position-vertical:absolute;mso-position-vertical-relative:text" o:gfxdata="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">
-                <v:imagedata r:id="rId9" o:title=""/>
-              </v:shape>
-            </w:pict>
-          </mc:Fallback>
-        </mc:AlternateContent>
-      </w:r>
-      <w:r>
-        <w:rPr>
-          <w:rFonts w:ascii="Times New Roman" w:hAnsi="Times New Roman" w:cs="Times New Roman"/>
-          <w:b/>
-          <w:bCs/>
-          <w:noProof/>
-          <w:color w:val="FFFFFF" w:themeColor="background1"/>
-          <w:sz w:val="28"/>
-          <w:szCs w:val="28"/>
-        </w:rPr>
-        <mc:AlternateContent>
-          <mc:Choice Requires="wpi">
-            <w:drawing>
-              <wp:anchor distT="0" distB="0" distL="114300" distR="114300" simplePos="0" relativeHeight="251686912" behindDoc="0" locked="0" layoutInCell="1" allowOverlap="1" wp14:anchorId="3F45B3B6" wp14:editId="42F64015">
-                <wp:simplePos x="0" y="0"/>
-                <wp:positionH relativeFrom="column">
-                  <wp:posOffset>649739</wp:posOffset>
-                </wp:positionH>
-                <wp:positionV relativeFrom="paragraph">
-                  <wp:posOffset>8740398</wp:posOffset>
-                </wp:positionV>
-                <wp:extent cx="333720" cy="360"/>
-                <wp:effectExtent l="38100" t="38100" r="47625" b="38100"/>
-                <wp:wrapNone/>
-                <wp:docPr id="518962771" name="Рукописный ввод 26"/>
-                <wp:cNvGraphicFramePr/>
-                <a:graphic xmlns:a="http://schemas.openxmlformats.org/drawingml/2006/main">
-                  <a:graphicData uri="http://schemas.microsoft.com/office/word/2010/wordprocessingInk">
-                    <w14:contentPart bwMode="auto" r:id="rId10">
-                      <w14:nvContentPartPr>
-                        <w14:cNvContentPartPr/>
-                      </w14:nvContentPartPr>
-                      <w14:xfrm>
-                        <a:off x="0" y="0"/>
-                        <a:ext cx="333720" cy="360"/>
-                      </w14:xfrm>
-                    </w14:contentPart>
-                  </a:graphicData>
-                </a:graphic>
-              </wp:anchor>
-            </w:drawing>
-          </mc:Choice>
-          <mc:Fallback>
-            <w:pict>
-              <v:shape w14:anchorId="357A9F0A" id="Рукописный ввод 26" o:spid="_x0000_s1026" type="#_x0000_t75" style="position:absolute;margin-left:50.8pt;margin-top:687.85pt;width:27pt;height:.75pt;z-index:251686912;visibility:visible;mso-wrap-style:square;mso-wrap-distance-left:9pt;mso-wrap-distance-top:0;mso-wrap-distance-right:9pt;mso-wrap-distance-bottom:0;mso-position-horizontal:absolute;mso-position-horizontal-relative:text;mso-position-vertical:absolute;mso-position-vertical-relative:text" o:gfxdata="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">
-                <v:imagedata r:id="rId11" o:title=""/>
-              </v:shape>
-            </w:pict>
-          </mc:Fallback>
-        </mc:AlternateContent>
-      </w:r>
-      <w:r>
-        <w:rPr>
-          <w:rFonts w:ascii="Times New Roman" w:hAnsi="Times New Roman" w:cs="Times New Roman"/>
-          <w:b/>
-          <w:bCs/>
-          <w:noProof/>
-          <w:color w:val="FFFFFF" w:themeColor="background1"/>
-          <w:sz w:val="28"/>
-          <w:szCs w:val="28"/>
-        </w:rPr>
-        <mc:AlternateContent>
-          <mc:Choice Requires="wpi">
-            <w:drawing>
-              <wp:anchor distT="0" distB="0" distL="114300" distR="114300" simplePos="0" relativeHeight="251685888" behindDoc="0" locked="0" layoutInCell="1" allowOverlap="1" wp14:anchorId="53170493" wp14:editId="659A35E2">
-                <wp:simplePos x="0" y="0"/>
-                <wp:positionH relativeFrom="column">
-                  <wp:posOffset>7600315</wp:posOffset>
-                </wp:positionH>
-                <wp:positionV relativeFrom="paragraph">
-                  <wp:posOffset>690245</wp:posOffset>
-                </wp:positionV>
-                <wp:extent cx="360" cy="360"/>
-                <wp:effectExtent l="76200" t="76200" r="76200" b="76200"/>
-                <wp:wrapNone/>
-                <wp:docPr id="412246902" name="Рукописный ввод 25"/>
-                <wp:cNvGraphicFramePr/>
-                <a:graphic xmlns:a="http://schemas.openxmlformats.org/drawingml/2006/main">
-                  <a:graphicData uri="http://schemas.microsoft.com/office/word/2010/wordprocessingInk">
-                    <w14:contentPart bwMode="auto" r:id="rId12">
-                      <w14:nvContentPartPr>
-                        <w14:cNvContentPartPr/>
-                      </w14:nvContentPartPr>
-                      <w14:xfrm>
-                        <a:off x="0" y="0"/>
-                        <a:ext cx="360" cy="360"/>
-                      </w14:xfrm>
-                    </w14:contentPart>
-                  </a:graphicData>
-                </a:graphic>
-              </wp:anchor>
-            </w:drawing>
-          </mc:Choice>
-          <mc:Fallback>
-            <w:pict>
-              <v:shape w14:anchorId="7F55865D" id="Рукописный ввод 25" o:spid="_x0000_s1026" type="#_x0000_t75" style="position:absolute;margin-left:595.6pt;margin-top:51.5pt;width:5.7pt;height:5.7pt;z-index:251685888;visibility:visible;mso-wrap-style:square;mso-wrap-distance-left:9pt;mso-wrap-distance-top:0;mso-wrap-distance-right:9pt;mso-wrap-distance-bottom:0;mso-position-horizontal:absolute;mso-position-horizontal-relative:text;mso-position-vertical:absolute;mso-position-vertical-relative:text" o:gfxdata="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">
-                <v:imagedata r:id="rId13" o:title=""/>
-              </v:shape>
-            </w:pict>
-          </mc:Fallback>
-        </mc:AlternateContent>
-      </w:r>
-      <w:r>
-        <w:rPr>
-          <w:rFonts w:ascii="Times New Roman" w:hAnsi="Times New Roman" w:cs="Times New Roman"/>
-          <w:b/>
-          <w:bCs/>
-          <w:noProof/>
-          <w:color w:val="FFFFFF" w:themeColor="background1"/>
-          <w:sz w:val="28"/>
-          <w:szCs w:val="28"/>
-        </w:rPr>
-        <mc:AlternateContent>
-          <mc:Choice Requires="wpi">
-            <w:drawing>
-              <wp:anchor distT="0" distB="0" distL="114300" distR="114300" simplePos="0" relativeHeight="251681792" behindDoc="0" locked="0" layoutInCell="1" allowOverlap="1" wp14:anchorId="170D1DF2" wp14:editId="4A26BA7E">
-                <wp:simplePos x="0" y="0"/>
-                <wp:positionH relativeFrom="column">
-                  <wp:posOffset>5373299</wp:posOffset>
-                </wp:positionH>
-                <wp:positionV relativeFrom="paragraph">
-                  <wp:posOffset>221302</wp:posOffset>
-                </wp:positionV>
-                <wp:extent cx="360" cy="360"/>
-                <wp:effectExtent l="76200" t="76200" r="76200" b="76200"/>
-                <wp:wrapNone/>
-                <wp:docPr id="386228894" name="Рукописный ввод 21"/>
-                <wp:cNvGraphicFramePr/>
-                <a:graphic xmlns:a="http://schemas.openxmlformats.org/drawingml/2006/main">
-                  <a:graphicData uri="http://schemas.microsoft.com/office/word/2010/wordprocessingInk">
-                    <w14:contentPart bwMode="auto" r:id="rId14">
-                      <w14:nvContentPartPr>
-                        <w14:cNvContentPartPr/>
-                      </w14:nvContentPartPr>
-                      <w14:xfrm>
-                        <a:off x="0" y="0"/>
-                        <a:ext cx="360" cy="360"/>
-                      </w14:xfrm>
-                    </w14:contentPart>
-                  </a:graphicData>
-                </a:graphic>
-              </wp:anchor>
-            </w:drawing>
-          </mc:Choice>
-          <mc:Fallback>
-            <w:pict>
-              <v:shape w14:anchorId="507EB914" id="Рукописный ввод 21" o:spid="_x0000_s1026" type="#_x0000_t75" style="position:absolute;margin-left:420.25pt;margin-top:14.6pt;width:5.7pt;height:5.7pt;z-index:251681792;visibility:visible;mso-wrap-style:square;mso-wrap-distance-left:9pt;mso-wrap-distance-top:0;mso-wrap-distance-right:9pt;mso-wrap-distance-bottom:0;mso-position-horizontal:absolute;mso-position-horizontal-relative:text;mso-position-vertical:absolute;mso-position-vertical-relative:text" o:gfxdata="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">
-                <v:imagedata r:id="rId15" o:title=""/>
-              </v:shape>
-            </w:pict>
-          </mc:Fallback>
-        </mc:AlternateContent>
-      </w:r>
-      <w:r>
-        <w:rPr>
-          <w:rFonts w:ascii="Times New Roman" w:hAnsi="Times New Roman" w:cs="Times New Roman"/>
-          <w:b/>
-          <w:bCs/>
-          <w:noProof/>
-          <w:color w:val="FFFFFF" w:themeColor="background1"/>
-          <w:sz w:val="28"/>
-          <w:szCs w:val="28"/>
-        </w:rPr>
-        <mc:AlternateContent>
-          <mc:Choice Requires="wpi">
-            <w:drawing>
-              <wp:anchor distT="0" distB="0" distL="114300" distR="114300" simplePos="0" relativeHeight="251665408" behindDoc="0" locked="0" layoutInCell="1" allowOverlap="1" wp14:anchorId="48658E0D" wp14:editId="330185A6">
-                <wp:simplePos x="0" y="0"/>
-                <wp:positionH relativeFrom="column">
-                  <wp:posOffset>994619</wp:posOffset>
-                </wp:positionH>
-                <wp:positionV relativeFrom="paragraph">
-                  <wp:posOffset>8755721</wp:posOffset>
-                </wp:positionV>
-                <wp:extent cx="360" cy="360"/>
-                <wp:effectExtent l="38100" t="38100" r="38100" b="38100"/>
-                <wp:wrapNone/>
-                <wp:docPr id="788557719" name="Рукописный ввод 4"/>
-                <wp:cNvGraphicFramePr/>
-                <a:graphic xmlns:a="http://schemas.openxmlformats.org/drawingml/2006/main">
-                  <a:graphicData uri="http://schemas.microsoft.com/office/word/2010/wordprocessingInk">
-                    <w14:contentPart bwMode="auto" r:id="rId16">
-                      <w14:nvContentPartPr>
-                        <w14:cNvContentPartPr/>
-                      </w14:nvContentPartPr>
-                      <w14:xfrm>
-                        <a:off x="0" y="0"/>
-                        <a:ext cx="360" cy="360"/>
-                      </w14:xfrm>
-                    </w14:contentPart>
-                  </a:graphicData>
-                </a:graphic>
-              </wp:anchor>
-            </w:drawing>
-          </mc:Choice>
-          <mc:Fallback>
-            <w:pict>
-              <v:shape w14:anchorId="2FF7E760" id="Рукописный ввод 4" o:spid="_x0000_s1026" type="#_x0000_t75" style="position:absolute;margin-left:77.8pt;margin-top:688.95pt;width:1.05pt;height:1.05pt;z-index:251665408;visibility:visible;mso-wrap-style:square;mso-wrap-distance-left:9pt;mso-wrap-distance-top:0;mso-wrap-distance-right:9pt;mso-wrap-distance-bottom:0;mso-position-horizontal:absolute;mso-position-horizontal-relative:text;mso-position-vertical:absolute;mso-position-vertical-relative:text" o:gfxdata="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">
-                <v:imagedata r:id="rId17" o:title=""/>
-              </v:shape>
-            </w:pict>
-          </mc:Fallback>
-        </mc:AlternateContent>
-      </w:r>
-    </w:p>
-    <w:p>
-      <w:pPr>
-        <w:spacing w:after="160" w:line="259" w:lineRule="auto"/>
-        <w:rPr>
-          <w:rFonts w:ascii="Times New Roman" w:hAnsi="Times New Roman" w:cs="Times New Roman"/>
-          <w:b/>
-          <w:bCs/>
-          <w:color w:val="000000" w:themeColor="text1"/>
-          <w:sz w:val="28"/>
-          <w:szCs w:val="28"/>
-        </w:rPr>
-      </w:pPr>
-      <w:r>
-        <w:rPr>
-          <w:b/>
-          <w:bCs/>
-          <w:noProof/>
-          <w:color w:val="000000" w:themeColor="text1"/>
-          <w:sz w:val="28"/>
-          <w:szCs w:val="28"/>
-        </w:rPr>
-        <mc:AlternateContent>
-          <mc:Choice Requires="wpi">
-            <w:drawing>
-              <wp:anchor distT="0" distB="0" distL="114300" distR="114300" simplePos="0" relativeHeight="251697152" behindDoc="0" locked="0" layoutInCell="1" allowOverlap="1" wp14:anchorId="71A174DE" wp14:editId="77FCAEB8">
-                <wp:simplePos x="0" y="0"/>
-                <wp:positionH relativeFrom="column">
-                  <wp:posOffset>121285</wp:posOffset>
-                </wp:positionH>
-                <wp:positionV relativeFrom="paragraph">
-                  <wp:posOffset>9087485</wp:posOffset>
-                </wp:positionV>
-                <wp:extent cx="246380" cy="360"/>
-                <wp:effectExtent l="38100" t="38100" r="39370" b="38100"/>
-                <wp:wrapNone/>
-                <wp:docPr id="389284575" name="Рукописный ввод 36"/>
-                <wp:cNvGraphicFramePr/>
-                <a:graphic xmlns:a="http://schemas.openxmlformats.org/drawingml/2006/main">
-                  <a:graphicData uri="http://schemas.microsoft.com/office/word/2010/wordprocessingInk">
-                    <w14:contentPart bwMode="auto" r:id="rId18">
-                      <w14:nvContentPartPr>
-                        <w14:cNvContentPartPr/>
-                      </w14:nvContentPartPr>
-                      <w14:xfrm>
-                        <a:off x="0" y="0"/>
-                        <a:ext cx="246380" cy="360"/>
-                      </w14:xfrm>
-                    </w14:contentPart>
-                  </a:graphicData>
-                </a:graphic>
-              </wp:anchor>
-            </w:drawing>
-          </mc:Choice>
-          <mc:Fallback>
-            <w:pict>
-              <v:shape w14:anchorId="60684B4C" id="Рукописный ввод 36" o:spid="_x0000_s1026" type="#_x0000_t75" style="position:absolute;margin-left:9.2pt;margin-top:715.2pt;width:20.1pt;height:.75pt;z-index:251697152;visibility:visible;mso-wrap-style:square;mso-wrap-distance-left:9pt;mso-wrap-distance-top:0;mso-wrap-distance-right:9pt;mso-wrap-distance-bottom:0;mso-position-horizontal:absolute;mso-position-horizontal-relative:text;mso-position-vertical:absolute;mso-position-vertical-relative:text" o:gfxdata="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">
-                <v:imagedata r:id="rId19" o:title=""/>
-              </v:shape>
-            </w:pict>
-          </mc:Fallback>
-        </mc:AlternateContent>
-      </w:r>
-      <w:r>
-        <w:rPr>
-          <w:rFonts w:ascii="Times New Roman" w:hAnsi="Times New Roman" w:cs="Times New Roman"/>
-          <w:b/>
-          <w:bCs/>
-          <w:noProof/>
-          <w:color w:val="000000" w:themeColor="text1"/>
-          <w:sz w:val="28"/>
-          <w:szCs w:val="28"/>
-        </w:rPr>
-        <w:drawing>
-          <wp:inline distT="0" distB="0" distL="0" distR="0" wp14:anchorId="47849E1D" wp14:editId="713CBE8B">
-            <wp:extent cx="5939790" cy="2733040"/>
-            <wp:effectExtent l="0" t="0" r="3810" b="0"/>
-            <wp:docPr id="2145279991" name="Рисунок 1"/>
-            <wp:cNvGraphicFramePr>
-              <a:graphicFrameLocks xmlns:a="http://schemas.openxmlformats.org/drawingml/2006/main" noChangeAspect="1"/>
-            </wp:cNvGraphicFramePr>
-            <a:graphic xmlns:a="http://schemas.openxmlformats.org/drawingml/2006/main">
-              <a:graphicData uri="http://schemas.openxmlformats.org/drawingml/2006/picture">
-                <pic:pic xmlns:pic="http://schemas.openxmlformats.org/drawingml/2006/picture">
-                  <pic:nvPicPr>
-                    <pic:cNvPr id="2145279991" name=""/>
-                    <pic:cNvPicPr/>
-                  </pic:nvPicPr>
-                  <pic:blipFill>
-                    <a:blip r:embed="rId20"/>
-                    <a:stretch>
-                      <a:fillRect/>
-                    </a:stretch>
-                  </pic:blipFill>
-                  <pic:spPr>
-                    <a:xfrm>
-                      <a:off x="0" y="0"/>
-                      <a:ext cx="5939790" cy="2733040"/>
-                    </a:xfrm>
-                    <a:prstGeom prst="rect">
-                      <a:avLst/>
-                    </a:prstGeom>
-                  </pic:spPr>
-                </pic:pic>
-              </a:graphicData>
-            </a:graphic>
-          </wp:inline>
-        </w:drawing>
-      </w:r>
-      <w:r>
-        <w:rPr>
-          <w:rFonts w:ascii="Times New Roman" w:hAnsi="Times New Roman" w:cs="Times New Roman"/>
-          <w:b/>
-          <w:bCs/>
-          <w:color w:val="000000" w:themeColor="text1"/>
-          <w:sz w:val="28"/>
-          <w:szCs w:val="28"/>
-        </w:rPr>
-        <w:br w:type="page"/>
-      </w:r>
-    </w:p>
-    <w:p>
-      <w:pPr>
         <w:spacing w:after="160" w:line="259" w:lineRule="auto"/>
         <w:jc w:val="center"/>
         <w:rPr>
@@ -2308,19 +2367,20 @@
           <w:color w:val="000000" w:themeColor="text1"/>
           <w:sz w:val="28"/>
           <w:szCs w:val="28"/>
+          <w:highlight w:val="darkGray"/>
         </w:rPr>
         <w:lastRenderedPageBreak/>
         <w:drawing>
-          <wp:anchor distT="0" distB="0" distL="114300" distR="114300" simplePos="0" relativeHeight="251698176" behindDoc="1" locked="0" layoutInCell="1" allowOverlap="1" wp14:anchorId="07FDF9DE" wp14:editId="00003B72">
+          <wp:anchor distT="0" distB="0" distL="114300" distR="114300" simplePos="0" relativeHeight="251698176" behindDoc="1" locked="0" layoutInCell="1" allowOverlap="1" wp14:anchorId="07FDF9DE" wp14:editId="7E36C2CA">
             <wp:simplePos x="0" y="0"/>
             <wp:positionH relativeFrom="page">
-              <wp:align>right</wp:align>
+              <wp:align>left</wp:align>
             </wp:positionH>
             <wp:positionV relativeFrom="paragraph">
-              <wp:posOffset>0</wp:posOffset>
+              <wp:posOffset>-720090</wp:posOffset>
             </wp:positionV>
-            <wp:extent cx="7543800" cy="10674350"/>
-            <wp:effectExtent l="0" t="0" r="0" b="0"/>
+            <wp:extent cx="7543793" cy="10673080"/>
+            <wp:effectExtent l="0" t="0" r="635" b="0"/>
             <wp:wrapNone/>
             <wp:docPr id="376411715" name="Рисунок 4"/>
             <wp:cNvGraphicFramePr>
@@ -2336,14 +2396,13 @@
                     </pic:cNvPicPr>
                   </pic:nvPicPr>
                   <pic:blipFill>
-                    <a:blip r:embed="rId21">
+                    <a:blip r:embed="rId8">
                       <a:extLst>
                         <a:ext uri="{28A0092B-C50C-407E-A947-70E740481C1C}">
                           <a14:useLocalDpi xmlns:a14="http://schemas.microsoft.com/office/drawing/2010/main" val="0"/>
                         </a:ext>
                       </a:extLst>
                     </a:blip>
-                    <a:srcRect/>
                     <a:stretch>
                       <a:fillRect/>
                     </a:stretch>
@@ -2351,7 +2410,7 @@
                   <pic:spPr bwMode="auto">
                     <a:xfrm>
                       <a:off x="0" y="0"/>
-                      <a:ext cx="7543800" cy="10674350"/>
+                      <a:ext cx="7543793" cy="10673080"/>
                     </a:xfrm>
                     <a:prstGeom prst="rect">
                       <a:avLst/>
@@ -2381,17 +2440,30 @@
           <w:color w:val="000000" w:themeColor="text1"/>
           <w:sz w:val="28"/>
           <w:szCs w:val="28"/>
-        </w:rPr>
-        <w:t xml:space="preserve">Код на </w:t>
-      </w:r>
-      <w:r>
-        <w:rPr>
-          <w:rFonts w:ascii="Times New Roman" w:hAnsi="Times New Roman" w:cs="Times New Roman"/>
-          <w:b/>
-          <w:bCs/>
-          <w:color w:val="000000" w:themeColor="text1"/>
-          <w:sz w:val="28"/>
-          <w:szCs w:val="28"/>
+          <w:highlight w:val="darkGray"/>
+        </w:rPr>
+        <w:t>Код на</w:t>
+      </w:r>
+      <w:r>
+        <w:rPr>
+          <w:rFonts w:ascii="Times New Roman" w:hAnsi="Times New Roman" w:cs="Times New Roman"/>
+          <w:b/>
+          <w:bCs/>
+          <w:color w:val="000000" w:themeColor="text1"/>
+          <w:sz w:val="28"/>
+          <w:szCs w:val="28"/>
+        </w:rPr>
+        <w:t xml:space="preserve"> </w:t>
+      </w:r>
+      <w:r>
+        <w:rPr>
+          <w:rFonts w:ascii="Times New Roman" w:hAnsi="Times New Roman" w:cs="Times New Roman"/>
+          <w:b/>
+          <w:bCs/>
+          <w:color w:val="000000" w:themeColor="text1"/>
+          <w:sz w:val="28"/>
+          <w:szCs w:val="28"/>
+          <w:highlight w:val="darkGray"/>
           <w:lang w:val="en-US"/>
         </w:rPr>
         <w:t>Pacal</w:t>
@@ -2482,9 +2554,9 @@
           <w:szCs w:val="28"/>
         </w:rPr>
         <w:drawing>
-          <wp:inline distT="0" distB="0" distL="0" distR="0" wp14:anchorId="3EF4F2B9" wp14:editId="4FC420B1">
-            <wp:extent cx="4935264" cy="3671837"/>
-            <wp:effectExtent l="0" t="0" r="0" b="5080"/>
+          <wp:inline distT="0" distB="0" distL="0" distR="0" wp14:anchorId="3EF4F2B9" wp14:editId="4F4A0580">
+            <wp:extent cx="3843345" cy="3671837"/>
+            <wp:effectExtent l="0" t="0" r="5080" b="5080"/>
             <wp:docPr id="1206855628" name="Рисунок 1"/>
             <wp:cNvGraphicFramePr>
               <a:graphicFrameLocks xmlns:a="http://schemas.openxmlformats.org/drawingml/2006/main" noChangeAspect="1"/>
@@ -2497,7 +2569,7 @@
                     <pic:cNvPicPr/>
                   </pic:nvPicPr>
                   <pic:blipFill>
-                    <a:blip r:embed="rId22">
+                    <a:blip r:embed="rId9">
                       <a:extLst>
                         <a:ext uri="{28A0092B-C50C-407E-A947-70E740481C1C}">
                           <a14:useLocalDpi xmlns:a14="http://schemas.microsoft.com/office/drawing/2010/main" val="0"/>
@@ -2511,7 +2583,7 @@
                   <pic:spPr>
                     <a:xfrm>
                       <a:off x="0" y="0"/>
-                      <a:ext cx="4935264" cy="3671837"/>
+                      <a:ext cx="3843345" cy="3671837"/>
                     </a:xfrm>
                     <a:prstGeom prst="rect">
                       <a:avLst/>
@@ -2536,357 +2608,334 @@
     <w:p>
       <w:pPr>
         <w:spacing w:after="160" w:line="259" w:lineRule="auto"/>
-        <w:rPr>
-          <w:rFonts w:ascii="Times New Roman" w:hAnsi="Times New Roman" w:cs="Times New Roman"/>
-          <w:color w:val="000000" w:themeColor="text1"/>
-          <w:sz w:val="28"/>
-          <w:szCs w:val="28"/>
-        </w:rPr>
-      </w:pPr>
-      <w:r>
-        <w:rPr>
-          <w:rFonts w:ascii="Times New Roman" w:hAnsi="Times New Roman" w:cs="Times New Roman"/>
-          <w:b/>
-          <w:bCs/>
-          <w:color w:val="FFFFFF" w:themeColor="background1"/>
-          <w:sz w:val="28"/>
-          <w:szCs w:val="28"/>
-          <w:u w:val="single"/>
+        <w:jc w:val="center"/>
+        <w:rPr>
+          <w:rFonts w:ascii="Times New Roman" w:hAnsi="Times New Roman" w:cs="Times New Roman"/>
+          <w:b/>
+          <w:bCs/>
+          <w:color w:val="000000" w:themeColor="text1"/>
+          <w:sz w:val="28"/>
+          <w:szCs w:val="28"/>
+        </w:rPr>
+      </w:pPr>
+      <w:r>
+        <w:rPr>
+          <w:rFonts w:ascii="Times New Roman" w:hAnsi="Times New Roman" w:cs="Times New Roman"/>
+          <w:b/>
+          <w:bCs/>
+          <w:color w:val="000000" w:themeColor="text1"/>
+          <w:sz w:val="28"/>
+          <w:szCs w:val="28"/>
         </w:rPr>
         <w:lastRenderedPageBreak/>
-        <w:t xml:space="preserve">д </w:t>
+        <w:t>Вывод:</w:t>
+      </w:r>
+    </w:p>
+    <w:p>
+      <w:pPr>
+        <w:spacing w:line="360" w:lineRule="auto"/>
+        <w:ind w:firstLine="709"/>
+        <w:rPr>
+          <w:rFonts w:ascii="Times New Roman" w:hAnsi="Times New Roman" w:cs="Times New Roman"/>
+          <w:color w:val="000000" w:themeColor="text1"/>
+          <w:sz w:val="28"/>
+          <w:szCs w:val="28"/>
+        </w:rPr>
+      </w:pPr>
+      <w:r>
+        <w:rPr>
+          <w:rFonts w:ascii="Times New Roman" w:hAnsi="Times New Roman" w:cs="Times New Roman"/>
+          <w:color w:val="000000" w:themeColor="text1"/>
+          <w:sz w:val="28"/>
+          <w:szCs w:val="28"/>
+        </w:rPr>
+        <w:t xml:space="preserve">В ходе данной лабораторной работы была успешно изучена базовая структура программы на языке </w:t>
       </w:r>
       <w:proofErr w:type="spellStart"/>
       <w:r>
         <w:rPr>
           <w:rFonts w:ascii="Times New Roman" w:hAnsi="Times New Roman" w:cs="Times New Roman"/>
-          <w:b/>
-          <w:bCs/>
-          <w:color w:val="FFFFFF" w:themeColor="background1"/>
-          <w:sz w:val="28"/>
-          <w:szCs w:val="28"/>
-          <w:u w:val="single"/>
-        </w:rPr>
-        <w:t>прогр</w:t>
+          <w:color w:val="000000" w:themeColor="text1"/>
+          <w:sz w:val="28"/>
+          <w:szCs w:val="28"/>
+        </w:rPr>
+        <w:t>Pascal</w:t>
       </w:r>
       <w:proofErr w:type="spellEnd"/>
+      <w:r>
+        <w:rPr>
+          <w:rFonts w:ascii="Times New Roman" w:hAnsi="Times New Roman" w:cs="Times New Roman"/>
+          <w:color w:val="000000" w:themeColor="text1"/>
+          <w:sz w:val="28"/>
+          <w:szCs w:val="28"/>
+        </w:rPr>
+        <w:t xml:space="preserve">. </w:t>
+      </w:r>
+      <w:r>
+        <w:rPr>
+          <w:rFonts w:ascii="Times New Roman" w:hAnsi="Times New Roman" w:cs="Times New Roman"/>
+          <w:color w:val="000000" w:themeColor="text1"/>
+          <w:sz w:val="28"/>
+          <w:szCs w:val="28"/>
+        </w:rPr>
+        <w:t>Я</w:t>
+      </w:r>
+      <w:r>
+        <w:rPr>
+          <w:rFonts w:ascii="Times New Roman" w:hAnsi="Times New Roman" w:cs="Times New Roman"/>
+          <w:color w:val="000000" w:themeColor="text1"/>
+          <w:sz w:val="28"/>
+          <w:szCs w:val="28"/>
+        </w:rPr>
+        <w:t xml:space="preserve"> познакомил</w:t>
+      </w:r>
+      <w:r>
+        <w:rPr>
+          <w:rFonts w:ascii="Times New Roman" w:hAnsi="Times New Roman" w:cs="Times New Roman"/>
+          <w:color w:val="000000" w:themeColor="text1"/>
+          <w:sz w:val="28"/>
+          <w:szCs w:val="28"/>
+        </w:rPr>
+        <w:t>ся</w:t>
+      </w:r>
+      <w:r>
+        <w:rPr>
+          <w:rFonts w:ascii="Times New Roman" w:hAnsi="Times New Roman" w:cs="Times New Roman"/>
+          <w:color w:val="000000" w:themeColor="text1"/>
+          <w:sz w:val="28"/>
+          <w:szCs w:val="28"/>
+        </w:rPr>
+        <w:t xml:space="preserve"> с обязательными разделами, такими как, раздел описаний и исполняемый блок. Ключевые слова </w:t>
+      </w:r>
+      <w:proofErr w:type="spellStart"/>
+      <w:r>
+        <w:rPr>
+          <w:rFonts w:ascii="Times New Roman" w:hAnsi="Times New Roman" w:cs="Times New Roman"/>
+          <w:color w:val="000000" w:themeColor="text1"/>
+          <w:sz w:val="28"/>
+          <w:szCs w:val="28"/>
+        </w:rPr>
+        <w:t>begin</w:t>
+      </w:r>
+      <w:proofErr w:type="spellEnd"/>
+      <w:r>
+        <w:rPr>
+          <w:rFonts w:ascii="Times New Roman" w:hAnsi="Times New Roman" w:cs="Times New Roman"/>
+          <w:color w:val="000000" w:themeColor="text1"/>
+          <w:sz w:val="28"/>
+          <w:szCs w:val="28"/>
+        </w:rPr>
+        <w:t xml:space="preserve"> и </w:t>
+      </w:r>
+      <w:proofErr w:type="spellStart"/>
+      <w:r>
+        <w:rPr>
+          <w:rFonts w:ascii="Times New Roman" w:hAnsi="Times New Roman" w:cs="Times New Roman"/>
+          <w:color w:val="000000" w:themeColor="text1"/>
+          <w:sz w:val="28"/>
+          <w:szCs w:val="28"/>
+        </w:rPr>
+        <w:t>end</w:t>
+      </w:r>
+      <w:proofErr w:type="spellEnd"/>
+      <w:r>
+        <w:rPr>
+          <w:rFonts w:ascii="Times New Roman" w:hAnsi="Times New Roman" w:cs="Times New Roman"/>
+          <w:color w:val="000000" w:themeColor="text1"/>
+          <w:sz w:val="28"/>
+          <w:szCs w:val="28"/>
+        </w:rPr>
+        <w:t xml:space="preserve"> с точкой были определены как границы главного блока, где размещается весь исполняемый код. Основное внимание было уделено освоению конструкции вывода данных на экран с помощью процедур </w:t>
+      </w:r>
+      <w:proofErr w:type="spellStart"/>
+      <w:r>
+        <w:rPr>
+          <w:rFonts w:ascii="Times New Roman" w:hAnsi="Times New Roman" w:cs="Times New Roman"/>
+          <w:color w:val="000000" w:themeColor="text1"/>
+          <w:sz w:val="28"/>
+          <w:szCs w:val="28"/>
+        </w:rPr>
+        <w:t>write</w:t>
+      </w:r>
+      <w:proofErr w:type="spellEnd"/>
+      <w:r>
+        <w:rPr>
+          <w:rFonts w:ascii="Times New Roman" w:hAnsi="Times New Roman" w:cs="Times New Roman"/>
+          <w:color w:val="000000" w:themeColor="text1"/>
+          <w:sz w:val="28"/>
+          <w:szCs w:val="28"/>
+        </w:rPr>
+        <w:t xml:space="preserve"> и </w:t>
+      </w:r>
+      <w:proofErr w:type="spellStart"/>
+      <w:r>
+        <w:rPr>
+          <w:rFonts w:ascii="Times New Roman" w:hAnsi="Times New Roman" w:cs="Times New Roman"/>
+          <w:color w:val="000000" w:themeColor="text1"/>
+          <w:sz w:val="28"/>
+          <w:szCs w:val="28"/>
+        </w:rPr>
+        <w:t>writeln</w:t>
+      </w:r>
+      <w:proofErr w:type="spellEnd"/>
+      <w:r>
+        <w:rPr>
+          <w:rFonts w:ascii="Times New Roman" w:hAnsi="Times New Roman" w:cs="Times New Roman"/>
+          <w:color w:val="000000" w:themeColor="text1"/>
+          <w:sz w:val="28"/>
+          <w:szCs w:val="28"/>
+        </w:rPr>
+        <w:t xml:space="preserve">. На практическом примере </w:t>
+      </w:r>
+      <w:r>
+        <w:rPr>
+          <w:rFonts w:ascii="Times New Roman" w:hAnsi="Times New Roman" w:cs="Times New Roman"/>
+          <w:color w:val="000000" w:themeColor="text1"/>
+          <w:sz w:val="28"/>
+          <w:szCs w:val="28"/>
+        </w:rPr>
+        <w:t>я</w:t>
+      </w:r>
+      <w:r>
+        <w:rPr>
+          <w:rFonts w:ascii="Times New Roman" w:hAnsi="Times New Roman" w:cs="Times New Roman"/>
+          <w:color w:val="000000" w:themeColor="text1"/>
+          <w:sz w:val="28"/>
+          <w:szCs w:val="28"/>
+        </w:rPr>
+        <w:t xml:space="preserve"> закрепили разницу между этими двумя операторами. Работа наглядно продемонстрировала порядок выполнения программы — сверху вниз, от первого оператора после </w:t>
+      </w:r>
+      <w:proofErr w:type="spellStart"/>
+      <w:r>
+        <w:rPr>
+          <w:rFonts w:ascii="Times New Roman" w:hAnsi="Times New Roman" w:cs="Times New Roman"/>
+          <w:color w:val="000000" w:themeColor="text1"/>
+          <w:sz w:val="28"/>
+          <w:szCs w:val="28"/>
+        </w:rPr>
+        <w:t>begin</w:t>
+      </w:r>
+      <w:proofErr w:type="spellEnd"/>
+      <w:r>
+        <w:rPr>
+          <w:rFonts w:ascii="Times New Roman" w:hAnsi="Times New Roman" w:cs="Times New Roman"/>
+          <w:color w:val="000000" w:themeColor="text1"/>
+          <w:sz w:val="28"/>
+          <w:szCs w:val="28"/>
+        </w:rPr>
+        <w:t xml:space="preserve"> до последнего перед </w:t>
+      </w:r>
+      <w:proofErr w:type="spellStart"/>
+      <w:r>
+        <w:rPr>
+          <w:rFonts w:ascii="Times New Roman" w:hAnsi="Times New Roman" w:cs="Times New Roman"/>
+          <w:color w:val="000000" w:themeColor="text1"/>
+          <w:sz w:val="28"/>
+          <w:szCs w:val="28"/>
+        </w:rPr>
+        <w:t>end</w:t>
+      </w:r>
+      <w:proofErr w:type="spellEnd"/>
+      <w:r>
+        <w:rPr>
+          <w:rFonts w:ascii="Times New Roman" w:hAnsi="Times New Roman" w:cs="Times New Roman"/>
+          <w:color w:val="000000" w:themeColor="text1"/>
+          <w:sz w:val="28"/>
+          <w:szCs w:val="28"/>
+        </w:rPr>
+        <w:t xml:space="preserve">. </w:t>
+      </w:r>
+    </w:p>
+    <w:p>
+      <w:pPr>
+        <w:spacing w:line="360" w:lineRule="auto"/>
+        <w:ind w:firstLine="709"/>
+        <w:rPr>
+          <w:rFonts w:ascii="Times New Roman" w:hAnsi="Times New Roman" w:cs="Times New Roman"/>
+          <w:color w:val="000000" w:themeColor="text1"/>
+          <w:sz w:val="28"/>
+          <w:szCs w:val="28"/>
+        </w:rPr>
+      </w:pPr>
+      <w:r>
+        <w:rPr>
+          <w:rFonts w:ascii="Times New Roman" w:hAnsi="Times New Roman" w:cs="Times New Roman"/>
+          <w:color w:val="000000" w:themeColor="text1"/>
+          <w:sz w:val="28"/>
+          <w:szCs w:val="28"/>
+        </w:rPr>
+        <w:t>Полученные знания о базовых конструкциях являются фундаментом для написания любых программ на этом языке.</w:t>
+      </w:r>
+      <w:r>
+        <w:rPr>
+          <w:rFonts w:ascii="Times New Roman" w:hAnsi="Times New Roman" w:cs="Times New Roman"/>
+          <w:color w:val="000000" w:themeColor="text1"/>
+          <w:sz w:val="28"/>
+          <w:szCs w:val="28"/>
+        </w:rPr>
+        <w:t xml:space="preserve"> </w:t>
+      </w:r>
+      <w:r>
+        <w:rPr>
+          <w:rFonts w:ascii="Times New Roman" w:hAnsi="Times New Roman" w:cs="Times New Roman"/>
+          <w:color w:val="000000" w:themeColor="text1"/>
+          <w:sz w:val="28"/>
+          <w:szCs w:val="28"/>
+        </w:rPr>
+        <w:t xml:space="preserve">Таким образом, поставленная цель работы по изучению структуры и основных команд была полностью достигнута. </w:t>
+      </w:r>
+    </w:p>
+    <w:p>
+      <w:pPr>
+        <w:spacing w:line="360" w:lineRule="auto"/>
+        <w:ind w:firstLine="709"/>
+        <w:rPr>
+          <w:rFonts w:ascii="Times New Roman" w:hAnsi="Times New Roman" w:cs="Times New Roman"/>
+          <w:color w:val="000000" w:themeColor="text1"/>
+          <w:sz w:val="28"/>
+          <w:szCs w:val="28"/>
+        </w:rPr>
+      </w:pPr>
+      <w:r>
+        <w:rPr>
+          <w:rFonts w:ascii="Times New Roman" w:hAnsi="Times New Roman" w:cs="Times New Roman"/>
+          <w:color w:val="000000" w:themeColor="text1"/>
+          <w:sz w:val="28"/>
+          <w:szCs w:val="28"/>
+        </w:rPr>
+        <w:t xml:space="preserve">ТЗ так же было выполнено полностью. Работу считаю </w:t>
+      </w:r>
+      <w:proofErr w:type="spellStart"/>
+      <w:r>
+        <w:rPr>
+          <w:rFonts w:ascii="Times New Roman" w:hAnsi="Times New Roman" w:cs="Times New Roman"/>
+          <w:color w:val="000000" w:themeColor="text1"/>
+          <w:sz w:val="28"/>
+          <w:szCs w:val="28"/>
+        </w:rPr>
+        <w:t>выполненой</w:t>
+      </w:r>
+      <w:proofErr w:type="spellEnd"/>
+      <w:r>
+        <w:rPr>
+          <w:rFonts w:ascii="Times New Roman" w:hAnsi="Times New Roman" w:cs="Times New Roman"/>
+          <w:color w:val="000000" w:themeColor="text1"/>
+          <w:sz w:val="28"/>
+          <w:szCs w:val="28"/>
+        </w:rPr>
+        <w:t>.</w:t>
+      </w:r>
     </w:p>
     <w:p>
       <w:pPr>
         <w:spacing w:after="160" w:line="259" w:lineRule="auto"/>
-        <w:jc w:val="center"/>
-        <w:rPr>
-          <w:rFonts w:ascii="Times New Roman" w:hAnsi="Times New Roman" w:cs="Times New Roman"/>
-          <w:b/>
-          <w:bCs/>
-          <w:color w:val="000000" w:themeColor="text1"/>
-          <w:sz w:val="28"/>
-          <w:szCs w:val="28"/>
-        </w:rPr>
-      </w:pPr>
-      <w:r>
-        <w:rPr>
-          <w:rFonts w:ascii="Times New Roman" w:hAnsi="Times New Roman" w:cs="Times New Roman"/>
-          <w:b/>
-          <w:bCs/>
-          <w:color w:val="000000" w:themeColor="text1"/>
-          <w:sz w:val="28"/>
-          <w:szCs w:val="28"/>
-        </w:rPr>
-        <w:t>Вывод:</w:t>
-      </w:r>
-    </w:p>
-    <w:p>
-      <w:pPr>
-        <w:spacing w:after="160" w:line="259" w:lineRule="auto"/>
-        <w:rPr>
-          <w:rFonts w:ascii="Times New Roman" w:hAnsi="Times New Roman" w:cs="Times New Roman"/>
-          <w:color w:val="000000" w:themeColor="text1"/>
-          <w:sz w:val="28"/>
-          <w:szCs w:val="28"/>
-        </w:rPr>
-      </w:pPr>
-      <w:r>
-        <w:rPr>
-          <w:rFonts w:ascii="Times New Roman" w:hAnsi="Times New Roman" w:cs="Times New Roman"/>
-          <w:color w:val="000000" w:themeColor="text1"/>
-          <w:sz w:val="28"/>
-          <w:szCs w:val="28"/>
-        </w:rPr>
-        <w:t xml:space="preserve">В ходе данной лабораторной работы была успешно изучена базовая структура программы на языке </w:t>
-      </w:r>
-      <w:proofErr w:type="spellStart"/>
-      <w:r>
-        <w:rPr>
-          <w:rFonts w:ascii="Times New Roman" w:hAnsi="Times New Roman" w:cs="Times New Roman"/>
-          <w:color w:val="000000" w:themeColor="text1"/>
-          <w:sz w:val="28"/>
-          <w:szCs w:val="28"/>
-        </w:rPr>
-        <w:t>Pascal</w:t>
-      </w:r>
-      <w:proofErr w:type="spellEnd"/>
-      <w:r>
-        <w:rPr>
-          <w:rFonts w:ascii="Times New Roman" w:hAnsi="Times New Roman" w:cs="Times New Roman"/>
-          <w:color w:val="000000" w:themeColor="text1"/>
-          <w:sz w:val="28"/>
-          <w:szCs w:val="28"/>
-        </w:rPr>
-        <w:t xml:space="preserve">. </w:t>
-      </w:r>
-      <w:r>
-        <w:rPr>
-          <w:rFonts w:ascii="Times New Roman" w:hAnsi="Times New Roman" w:cs="Times New Roman"/>
-          <w:color w:val="000000" w:themeColor="text1"/>
-          <w:sz w:val="28"/>
-          <w:szCs w:val="28"/>
-        </w:rPr>
-        <w:t>Я</w:t>
-      </w:r>
-      <w:r>
-        <w:rPr>
-          <w:rFonts w:ascii="Times New Roman" w:hAnsi="Times New Roman" w:cs="Times New Roman"/>
-          <w:color w:val="000000" w:themeColor="text1"/>
-          <w:sz w:val="28"/>
-          <w:szCs w:val="28"/>
-        </w:rPr>
-        <w:t xml:space="preserve"> познакомил</w:t>
-      </w:r>
-      <w:r>
-        <w:rPr>
-          <w:rFonts w:ascii="Times New Roman" w:hAnsi="Times New Roman" w:cs="Times New Roman"/>
-          <w:color w:val="000000" w:themeColor="text1"/>
-          <w:sz w:val="28"/>
-          <w:szCs w:val="28"/>
-        </w:rPr>
-        <w:t>ся</w:t>
-      </w:r>
-      <w:r>
-        <w:rPr>
-          <w:rFonts w:ascii="Times New Roman" w:hAnsi="Times New Roman" w:cs="Times New Roman"/>
-          <w:color w:val="000000" w:themeColor="text1"/>
-          <w:sz w:val="28"/>
-          <w:szCs w:val="28"/>
-        </w:rPr>
-        <w:t xml:space="preserve"> с обязательными разделами, такими как, раздел описаний и исполняемый блок. Ключевые слова </w:t>
-      </w:r>
-      <w:proofErr w:type="spellStart"/>
-      <w:r>
-        <w:rPr>
-          <w:rFonts w:ascii="Times New Roman" w:hAnsi="Times New Roman" w:cs="Times New Roman"/>
-          <w:color w:val="000000" w:themeColor="text1"/>
-          <w:sz w:val="28"/>
-          <w:szCs w:val="28"/>
-        </w:rPr>
-        <w:t>begin</w:t>
-      </w:r>
-      <w:proofErr w:type="spellEnd"/>
-      <w:r>
-        <w:rPr>
-          <w:rFonts w:ascii="Times New Roman" w:hAnsi="Times New Roman" w:cs="Times New Roman"/>
-          <w:color w:val="000000" w:themeColor="text1"/>
-          <w:sz w:val="28"/>
-          <w:szCs w:val="28"/>
-        </w:rPr>
-        <w:t xml:space="preserve"> и </w:t>
-      </w:r>
-      <w:proofErr w:type="spellStart"/>
-      <w:r>
-        <w:rPr>
-          <w:rFonts w:ascii="Times New Roman" w:hAnsi="Times New Roman" w:cs="Times New Roman"/>
-          <w:color w:val="000000" w:themeColor="text1"/>
-          <w:sz w:val="28"/>
-          <w:szCs w:val="28"/>
-        </w:rPr>
-        <w:t>end</w:t>
-      </w:r>
-      <w:proofErr w:type="spellEnd"/>
-      <w:r>
-        <w:rPr>
-          <w:rFonts w:ascii="Times New Roman" w:hAnsi="Times New Roman" w:cs="Times New Roman"/>
-          <w:color w:val="000000" w:themeColor="text1"/>
-          <w:sz w:val="28"/>
-          <w:szCs w:val="28"/>
-        </w:rPr>
-        <w:t xml:space="preserve"> с точкой были определены как границы главного блока, где размещается весь исполняемый код. Основное внимание было уделено освоению конструкции вывода данных на экран с помощью процедур </w:t>
-      </w:r>
-      <w:proofErr w:type="spellStart"/>
-      <w:r>
-        <w:rPr>
-          <w:rFonts w:ascii="Times New Roman" w:hAnsi="Times New Roman" w:cs="Times New Roman"/>
-          <w:color w:val="000000" w:themeColor="text1"/>
-          <w:sz w:val="28"/>
-          <w:szCs w:val="28"/>
-        </w:rPr>
-        <w:t>write</w:t>
-      </w:r>
-      <w:proofErr w:type="spellEnd"/>
-      <w:r>
-        <w:rPr>
-          <w:rFonts w:ascii="Times New Roman" w:hAnsi="Times New Roman" w:cs="Times New Roman"/>
-          <w:color w:val="000000" w:themeColor="text1"/>
-          <w:sz w:val="28"/>
-          <w:szCs w:val="28"/>
-        </w:rPr>
-        <w:t xml:space="preserve"> и </w:t>
-      </w:r>
-      <w:proofErr w:type="spellStart"/>
-      <w:r>
-        <w:rPr>
-          <w:rFonts w:ascii="Times New Roman" w:hAnsi="Times New Roman" w:cs="Times New Roman"/>
-          <w:color w:val="000000" w:themeColor="text1"/>
-          <w:sz w:val="28"/>
-          <w:szCs w:val="28"/>
-        </w:rPr>
-        <w:t>writeln</w:t>
-      </w:r>
-      <w:proofErr w:type="spellEnd"/>
-      <w:r>
-        <w:rPr>
-          <w:rFonts w:ascii="Times New Roman" w:hAnsi="Times New Roman" w:cs="Times New Roman"/>
-          <w:color w:val="000000" w:themeColor="text1"/>
-          <w:sz w:val="28"/>
-          <w:szCs w:val="28"/>
-        </w:rPr>
-        <w:t xml:space="preserve">. На практическом примере </w:t>
-      </w:r>
-      <w:r>
-        <w:rPr>
-          <w:rFonts w:ascii="Times New Roman" w:hAnsi="Times New Roman" w:cs="Times New Roman"/>
-          <w:color w:val="000000" w:themeColor="text1"/>
-          <w:sz w:val="28"/>
-          <w:szCs w:val="28"/>
-        </w:rPr>
-        <w:t>я</w:t>
-      </w:r>
-      <w:r>
-        <w:rPr>
-          <w:rFonts w:ascii="Times New Roman" w:hAnsi="Times New Roman" w:cs="Times New Roman"/>
-          <w:color w:val="000000" w:themeColor="text1"/>
-          <w:sz w:val="28"/>
-          <w:szCs w:val="28"/>
-        </w:rPr>
-        <w:t xml:space="preserve"> закрепили разницу между этими двумя операторами. Работа наглядно продемонстрировала порядок выполнения программы — сверху вниз, от первого оператора после </w:t>
-      </w:r>
-      <w:proofErr w:type="spellStart"/>
-      <w:r>
-        <w:rPr>
-          <w:rFonts w:ascii="Times New Roman" w:hAnsi="Times New Roman" w:cs="Times New Roman"/>
-          <w:color w:val="000000" w:themeColor="text1"/>
-          <w:sz w:val="28"/>
-          <w:szCs w:val="28"/>
-        </w:rPr>
-        <w:t>begin</w:t>
-      </w:r>
-      <w:proofErr w:type="spellEnd"/>
-      <w:r>
-        <w:rPr>
-          <w:rFonts w:ascii="Times New Roman" w:hAnsi="Times New Roman" w:cs="Times New Roman"/>
-          <w:color w:val="000000" w:themeColor="text1"/>
-          <w:sz w:val="28"/>
-          <w:szCs w:val="28"/>
-        </w:rPr>
-        <w:t xml:space="preserve"> до последнего перед </w:t>
-      </w:r>
-      <w:proofErr w:type="spellStart"/>
-      <w:r>
-        <w:rPr>
-          <w:rFonts w:ascii="Times New Roman" w:hAnsi="Times New Roman" w:cs="Times New Roman"/>
-          <w:color w:val="000000" w:themeColor="text1"/>
-          <w:sz w:val="28"/>
-          <w:szCs w:val="28"/>
-        </w:rPr>
-        <w:t>end</w:t>
-      </w:r>
-      <w:proofErr w:type="spellEnd"/>
-      <w:r>
-        <w:rPr>
-          <w:rFonts w:ascii="Times New Roman" w:hAnsi="Times New Roman" w:cs="Times New Roman"/>
-          <w:color w:val="000000" w:themeColor="text1"/>
-          <w:sz w:val="28"/>
-          <w:szCs w:val="28"/>
-        </w:rPr>
-        <w:t xml:space="preserve">. </w:t>
-      </w:r>
-    </w:p>
-    <w:p>
-      <w:pPr>
-        <w:spacing w:after="160" w:line="259" w:lineRule="auto"/>
-        <w:rPr>
-          <w:rFonts w:ascii="Times New Roman" w:hAnsi="Times New Roman" w:cs="Times New Roman"/>
-          <w:color w:val="000000" w:themeColor="text1"/>
-          <w:sz w:val="28"/>
-          <w:szCs w:val="28"/>
-        </w:rPr>
-      </w:pPr>
-      <w:r>
-        <w:rPr>
-          <w:rFonts w:ascii="Times New Roman" w:hAnsi="Times New Roman" w:cs="Times New Roman"/>
-          <w:color w:val="000000" w:themeColor="text1"/>
-          <w:sz w:val="28"/>
-          <w:szCs w:val="28"/>
-        </w:rPr>
-        <w:t>Полученные знания о базовых конструкциях являются фундаментом для написания любых программ на этом языке.</w:t>
-      </w:r>
-      <w:r>
-        <w:rPr>
-          <w:rFonts w:ascii="Times New Roman" w:hAnsi="Times New Roman" w:cs="Times New Roman"/>
-          <w:color w:val="000000" w:themeColor="text1"/>
-          <w:sz w:val="28"/>
-          <w:szCs w:val="28"/>
-        </w:rPr>
-        <w:t xml:space="preserve"> </w:t>
-      </w:r>
-      <w:r>
-        <w:rPr>
-          <w:rFonts w:ascii="Times New Roman" w:hAnsi="Times New Roman" w:cs="Times New Roman"/>
-          <w:color w:val="000000" w:themeColor="text1"/>
-          <w:sz w:val="28"/>
-          <w:szCs w:val="28"/>
-        </w:rPr>
-        <w:t xml:space="preserve">Таким образом, поставленная цель работы по изучению структуры и основных команд была полностью достигнута. </w:t>
-      </w:r>
-    </w:p>
-    <w:p>
-      <w:pPr>
-        <w:spacing w:after="160" w:line="259" w:lineRule="auto"/>
-        <w:rPr>
-          <w:rFonts w:ascii="Times New Roman" w:hAnsi="Times New Roman" w:cs="Times New Roman"/>
-          <w:color w:val="000000" w:themeColor="text1"/>
-          <w:sz w:val="28"/>
-          <w:szCs w:val="28"/>
-        </w:rPr>
-      </w:pPr>
-      <w:r>
-        <w:rPr>
-          <w:rFonts w:ascii="Times New Roman" w:hAnsi="Times New Roman" w:cs="Times New Roman"/>
-          <w:color w:val="000000" w:themeColor="text1"/>
-          <w:sz w:val="28"/>
-          <w:szCs w:val="28"/>
-        </w:rPr>
-        <w:t xml:space="preserve">ТЗ так же было выполнено полностью. Работу считаю </w:t>
-      </w:r>
-      <w:proofErr w:type="spellStart"/>
-      <w:r>
-        <w:rPr>
-          <w:rFonts w:ascii="Times New Roman" w:hAnsi="Times New Roman" w:cs="Times New Roman"/>
-          <w:color w:val="000000" w:themeColor="text1"/>
-          <w:sz w:val="28"/>
-          <w:szCs w:val="28"/>
-        </w:rPr>
-        <w:t>выполненой</w:t>
-      </w:r>
-      <w:proofErr w:type="spellEnd"/>
-      <w:r>
-        <w:rPr>
-          <w:rFonts w:ascii="Times New Roman" w:hAnsi="Times New Roman" w:cs="Times New Roman"/>
-          <w:color w:val="000000" w:themeColor="text1"/>
-          <w:sz w:val="28"/>
-          <w:szCs w:val="28"/>
-        </w:rPr>
-        <w:t>.</w:t>
-      </w:r>
+        <w:rPr>
+          <w:rFonts w:ascii="Times New Roman" w:hAnsi="Times New Roman" w:cs="Times New Roman"/>
+          <w:color w:val="000000" w:themeColor="text1"/>
+          <w:sz w:val="28"/>
+          <w:szCs w:val="28"/>
+        </w:rPr>
+      </w:pPr>
       <w:r>
         <w:rPr>
           <w:rFonts w:ascii="Times New Roman" w:hAnsi="Times New Roman" w:cs="Times New Roman"/>
@@ -4385,174 +4434,6 @@
 </w:styles>
 </file>
 
-<file path=word/ink/ink1.xml><?xml version="1.0" encoding="utf-8"?>
-<inkml:ink xmlns:inkml="http://www.w3.org/2003/InkML">
-  <inkml:definitions>
-    <inkml:context xml:id="ctx0">
-      <inkml:inkSource xml:id="inkSrc0">
-        <inkml:traceFormat>
-          <inkml:channel name="X" type="integer" min="-2.14748E9" max="2.14748E9" units="cm"/>
-          <inkml:channel name="Y" type="integer" min="-2.14748E9" max="2.14748E9" units="cm"/>
-          <inkml:channel name="F" type="integer" max="32767" units="dev"/>
-        </inkml:traceFormat>
-        <inkml:channelProperties>
-          <inkml:channelProperty channel="X" name="resolution" value="1000" units="1/cm"/>
-          <inkml:channelProperty channel="Y" name="resolution" value="1000" units="1/cm"/>
-          <inkml:channelProperty channel="F" name="resolution" value="0" units="1/dev"/>
-        </inkml:channelProperties>
-      </inkml:inkSource>
-      <inkml:timestamp xml:id="ts0" timeString="2025-10-21T13:29:07.813"/>
-    </inkml:context>
-    <inkml:brush xml:id="br0">
-      <inkml:brushProperty name="width" value="0.025" units="cm"/>
-      <inkml:brushProperty name="height" value="0.025" units="cm"/>
-      <inkml:brushProperty name="color" value="#FFFFFF"/>
-    </inkml:brush>
-  </inkml:definitions>
-  <inkml:trace contextRef="#ctx0" brushRef="#br0">0 333 24575,'2'-2'0,"0"0"0,0-1 0,0 1 0,0-1 0,0 0 0,-1 1 0,1-1 0,-1 0 0,0 0 0,1-5 0,0 4 0,9-22 0,2 0 0,0 1 0,2 0 0,1 1 0,0 1 0,31-33 0,-12 9 129,-13 14-1623,-15 24-5332</inkml:trace>
-  <inkml:trace contextRef="#ctx0" brushRef="#br0" timeOffset="2557.47">16 318 24575,'36'20'0,"37"29"0,-17-11 0,142 90 0,-171-107 0,10 4 0,-24-18-1365,0 1-5461</inkml:trace>
-</inkml:ink>
-</file>
-
-<file path=word/ink/ink2.xml><?xml version="1.0" encoding="utf-8"?>
-<inkml:ink xmlns:inkml="http://www.w3.org/2003/InkML">
-  <inkml:definitions>
-    <inkml:context xml:id="ctx0">
-      <inkml:inkSource xml:id="inkSrc0">
-        <inkml:traceFormat>
-          <inkml:channel name="X" type="integer" min="-2.14748E9" max="2.14748E9" units="cm"/>
-          <inkml:channel name="Y" type="integer" min="-2.14748E9" max="2.14748E9" units="cm"/>
-        </inkml:traceFormat>
-        <inkml:channelProperties>
-          <inkml:channelProperty channel="X" name="resolution" value="1000" units="1/cm"/>
-          <inkml:channelProperty channel="Y" name="resolution" value="1000" units="1/cm"/>
-        </inkml:channelProperties>
-      </inkml:inkSource>
-      <inkml:timestamp xml:id="ts0" timeString="2025-10-21T13:29:01.762"/>
-    </inkml:context>
-    <inkml:brush xml:id="br0">
-      <inkml:brushProperty name="width" value="0.025" units="cm"/>
-      <inkml:brushProperty name="height" value="0.025" units="cm"/>
-      <inkml:brushProperty name="color" value="#FFFFFF"/>
-      <inkml:brushProperty name="ignorePressure" value="1"/>
-    </inkml:brush>
-  </inkml:definitions>
-  <inkml:trace contextRef="#ctx0" brushRef="#br0">926 1,'-926'0,"926"0</inkml:trace>
-</inkml:ink>
-</file>
-
-<file path=word/ink/ink3.xml><?xml version="1.0" encoding="utf-8"?>
-<inkml:ink xmlns:inkml="http://www.w3.org/2003/InkML">
-  <inkml:definitions>
-    <inkml:context xml:id="ctx0">
-      <inkml:inkSource xml:id="inkSrc0">
-        <inkml:traceFormat>
-          <inkml:channel name="X" type="integer" min="-2.14748E9" max="2.14748E9" units="cm"/>
-          <inkml:channel name="Y" type="integer" min="-2.14748E9" max="2.14748E9" units="cm"/>
-        </inkml:traceFormat>
-        <inkml:channelProperties>
-          <inkml:channelProperty channel="X" name="resolution" value="1000" units="1/cm"/>
-          <inkml:channelProperty channel="Y" name="resolution" value="1000" units="1/cm"/>
-        </inkml:channelProperties>
-      </inkml:inkSource>
-      <inkml:timestamp xml:id="ts0" timeString="2025-10-21T13:28:38.481"/>
-    </inkml:context>
-    <inkml:brush xml:id="br0">
-      <inkml:brushProperty name="width" value="0.2" units="cm"/>
-      <inkml:brushProperty name="height" value="0.2" units="cm"/>
-      <inkml:brushProperty name="color" value="#FFFFFF"/>
-      <inkml:brushProperty name="ignorePressure" value="1"/>
-    </inkml:brush>
-  </inkml:definitions>
-  <inkml:trace contextRef="#ctx0" brushRef="#br0">0 0</inkml:trace>
-  <inkml:trace contextRef="#ctx0" brushRef="#br0" timeOffset="130.79">0 0</inkml:trace>
-  <inkml:trace contextRef="#ctx0" brushRef="#br0" timeOffset="701.55">0 0</inkml:trace>
-</inkml:ink>
-</file>
-
-<file path=word/ink/ink4.xml><?xml version="1.0" encoding="utf-8"?>
-<inkml:ink xmlns:inkml="http://www.w3.org/2003/InkML">
-  <inkml:definitions>
-    <inkml:context xml:id="ctx0">
-      <inkml:inkSource xml:id="inkSrc0">
-        <inkml:traceFormat>
-          <inkml:channel name="X" type="integer" min="-2.14748E9" max="2.14748E9" units="cm"/>
-          <inkml:channel name="Y" type="integer" min="-2.14748E9" max="2.14748E9" units="cm"/>
-        </inkml:traceFormat>
-        <inkml:channelProperties>
-          <inkml:channelProperty channel="X" name="resolution" value="1000" units="1/cm"/>
-          <inkml:channelProperty channel="Y" name="resolution" value="1000" units="1/cm"/>
-        </inkml:channelProperties>
-      </inkml:inkSource>
-      <inkml:timestamp xml:id="ts0" timeString="2025-10-21T13:28:36.771"/>
-    </inkml:context>
-    <inkml:brush xml:id="br0">
-      <inkml:brushProperty name="width" value="0.2" units="cm"/>
-      <inkml:brushProperty name="height" value="0.2" units="cm"/>
-      <inkml:brushProperty name="color" value="#FFFFFF"/>
-      <inkml:brushProperty name="ignorePressure" value="1"/>
-    </inkml:brush>
-  </inkml:definitions>
-  <inkml:trace contextRef="#ctx0" brushRef="#br0">0 0</inkml:trace>
-</inkml:ink>
-</file>
-
-<file path=word/ink/ink5.xml><?xml version="1.0" encoding="utf-8"?>
-<inkml:ink xmlns:inkml="http://www.w3.org/2003/InkML">
-  <inkml:definitions>
-    <inkml:context xml:id="ctx0">
-      <inkml:inkSource xml:id="inkSrc0">
-        <inkml:traceFormat>
-          <inkml:channel name="X" type="integer" min="-2.14748E9" max="2.14748E9" units="cm"/>
-          <inkml:channel name="Y" type="integer" min="-2.14748E9" max="2.14748E9" units="cm"/>
-          <inkml:channel name="F" type="integer" max="32767" units="dev"/>
-        </inkml:traceFormat>
-        <inkml:channelProperties>
-          <inkml:channelProperty channel="X" name="resolution" value="1000" units="1/cm"/>
-          <inkml:channelProperty channel="Y" name="resolution" value="1000" units="1/cm"/>
-          <inkml:channelProperty channel="F" name="resolution" value="0" units="1/dev"/>
-        </inkml:channelProperties>
-      </inkml:inkSource>
-      <inkml:timestamp xml:id="ts0" timeString="2025-10-21T13:26:46.453"/>
-    </inkml:context>
-    <inkml:brush xml:id="br0">
-      <inkml:brushProperty name="width" value="0.035" units="cm"/>
-      <inkml:brushProperty name="height" value="0.035" units="cm"/>
-    </inkml:brush>
-  </inkml:definitions>
-  <inkml:trace contextRef="#ctx0" brushRef="#br0">0 1 24575,'0'0'-8191</inkml:trace>
-</inkml:ink>
-</file>
-
-<file path=word/ink/ink6.xml><?xml version="1.0" encoding="utf-8"?>
-<inkml:ink xmlns:inkml="http://www.w3.org/2003/InkML">
-  <inkml:definitions>
-    <inkml:context xml:id="ctx0">
-      <inkml:inkSource xml:id="inkSrc0">
-        <inkml:traceFormat>
-          <inkml:channel name="X" type="integer" min="-2.14748E9" max="2.14748E9" units="cm"/>
-          <inkml:channel name="Y" type="integer" min="-2.14748E9" max="2.14748E9" units="cm"/>
-        </inkml:traceFormat>
-        <inkml:channelProperties>
-          <inkml:channelProperty channel="X" name="resolution" value="1000" units="1/cm"/>
-          <inkml:channelProperty channel="Y" name="resolution" value="1000" units="1/cm"/>
-        </inkml:channelProperties>
-      </inkml:inkSource>
-      <inkml:timestamp xml:id="ts0" timeString="2025-10-21T13:29:50.669"/>
-    </inkml:context>
-    <inkml:brush xml:id="br0">
-      <inkml:brushProperty name="width" value="0.025" units="cm"/>
-      <inkml:brushProperty name="height" value="0.025" units="cm"/>
-      <inkml:brushProperty name="color" value="#FFFFFF"/>
-      <inkml:brushProperty name="ignorePressure" value="1"/>
-    </inkml:brush>
-  </inkml:definitions>
-  <inkml:trace contextRef="#ctx0" brushRef="#br0">684 1,'-668'0,"657"0</inkml:trace>
-  <inkml:trace contextRef="#ctx0" brushRef="#br0" timeOffset="635.91">0 1,'0'0</inkml:trace>
-  <inkml:trace contextRef="#ctx0" brushRef="#br0" timeOffset="2720.13">0 1,'304'0,"-476"0,167 0</inkml:trace>
-</inkml:ink>
-</file>
-
 <file path=word/theme/theme1.xml><?xml version="1.0" encoding="utf-8"?>
 <a:theme xmlns:a="http://schemas.openxmlformats.org/drawingml/2006/main" name="Тема Office">
   <a:themeElements>

</xml_diff>